<commit_message>
Adding Excel measurement resutls
</commit_message>
<xml_diff>
--- a/Nikola Majer završni rad okvirno (1).docx
+++ b/Nikola Majer završni rad okvirno (1).docx
@@ -1084,8 +1084,10 @@
             <w:rPr>
               <w:rFonts w:asciiTheme="minorHAnsi" w:eastAsiaTheme="minorEastAsia" w:hAnsiTheme="minorHAnsi"/>
               <w:noProof/>
-              <w:sz w:val="22"/>
-              <w:lang w:eastAsia="hr-HR"/>
+              <w:kern w:val="2"/>
+              <w:szCs w:val="24"/>
+              <w:lang w:val="en-GB" w:eastAsia="en-GB"/>
+              <w14:ligatures w14:val="standardContextual"/>
             </w:rPr>
           </w:pPr>
           <w:r>
@@ -1097,7 +1099,7 @@
           <w:r>
             <w:fldChar w:fldCharType="separate"/>
           </w:r>
-          <w:hyperlink w:anchor="_Toc232428122" w:history="1">
+          <w:hyperlink w:anchor="_Toc232881699" w:history="1">
             <w:r>
               <w:rPr>
                 <w:rStyle w:val="Hyperlink"/>
@@ -1124,7 +1126,7 @@
                 <w:noProof/>
                 <w:webHidden/>
               </w:rPr>
-              <w:instrText xml:space="preserve"> PAGEREF _Toc232428122 \h </w:instrText>
+              <w:instrText xml:space="preserve"> PAGEREF _Toc232881699 \h </w:instrText>
             </w:r>
             <w:r>
               <w:rPr>
@@ -1164,11 +1166,13 @@
             <w:rPr>
               <w:rFonts w:asciiTheme="minorHAnsi" w:eastAsiaTheme="minorEastAsia" w:hAnsiTheme="minorHAnsi"/>
               <w:noProof/>
-              <w:sz w:val="22"/>
-              <w:lang w:eastAsia="hr-HR"/>
+              <w:kern w:val="2"/>
+              <w:szCs w:val="24"/>
+              <w:lang w:val="en-GB" w:eastAsia="en-GB"/>
+              <w14:ligatures w14:val="standardContextual"/>
             </w:rPr>
           </w:pPr>
-          <w:hyperlink w:anchor="_Toc232428123" w:history="1">
+          <w:hyperlink w:anchor="_Toc232881700" w:history="1">
             <w:r>
               <w:rPr>
                 <w:rStyle w:val="Hyperlink"/>
@@ -1195,7 +1199,7 @@
                 <w:noProof/>
                 <w:webHidden/>
               </w:rPr>
-              <w:instrText xml:space="preserve"> PAGEREF _Toc232428123 \h </w:instrText>
+              <w:instrText xml:space="preserve"> PAGEREF _Toc232881700 \h </w:instrText>
             </w:r>
             <w:r>
               <w:rPr>
@@ -1235,11 +1239,13 @@
             <w:rPr>
               <w:rFonts w:asciiTheme="minorHAnsi" w:eastAsiaTheme="minorEastAsia" w:hAnsiTheme="minorHAnsi"/>
               <w:noProof/>
-              <w:sz w:val="22"/>
-              <w:lang w:eastAsia="hr-HR"/>
+              <w:kern w:val="2"/>
+              <w:szCs w:val="24"/>
+              <w:lang w:val="en-GB" w:eastAsia="en-GB"/>
+              <w14:ligatures w14:val="standardContextual"/>
             </w:rPr>
           </w:pPr>
-          <w:hyperlink w:anchor="_Toc232428124" w:history="1">
+          <w:hyperlink w:anchor="_Toc232881701" w:history="1">
             <w:r>
               <w:rPr>
                 <w:rStyle w:val="Hyperlink"/>
@@ -1266,7 +1272,7 @@
                 <w:noProof/>
                 <w:webHidden/>
               </w:rPr>
-              <w:instrText xml:space="preserve"> PAGEREF _Toc232428124 \h </w:instrText>
+              <w:instrText xml:space="preserve"> PAGEREF _Toc232881701 \h </w:instrText>
             </w:r>
             <w:r>
               <w:rPr>
@@ -1306,11 +1312,13 @@
             <w:rPr>
               <w:rFonts w:asciiTheme="minorHAnsi" w:eastAsiaTheme="minorEastAsia" w:hAnsiTheme="minorHAnsi"/>
               <w:noProof/>
-              <w:sz w:val="22"/>
-              <w:lang w:eastAsia="hr-HR"/>
+              <w:kern w:val="2"/>
+              <w:szCs w:val="24"/>
+              <w:lang w:val="en-GB" w:eastAsia="en-GB"/>
+              <w14:ligatures w14:val="standardContextual"/>
             </w:rPr>
           </w:pPr>
-          <w:hyperlink w:anchor="_Toc232428125" w:history="1">
+          <w:hyperlink w:anchor="_Toc232881702" w:history="1">
             <w:r>
               <w:rPr>
                 <w:rStyle w:val="Hyperlink"/>
@@ -1337,7 +1345,7 @@
                 <w:noProof/>
                 <w:webHidden/>
               </w:rPr>
-              <w:instrText xml:space="preserve"> PAGEREF _Toc232428125 \h </w:instrText>
+              <w:instrText xml:space="preserve"> PAGEREF _Toc232881702 \h </w:instrText>
             </w:r>
             <w:r>
               <w:rPr>
@@ -1374,11 +1382,13 @@
             <w:rPr>
               <w:rFonts w:asciiTheme="minorHAnsi" w:eastAsiaTheme="minorEastAsia" w:hAnsiTheme="minorHAnsi"/>
               <w:noProof/>
-              <w:sz w:val="22"/>
-              <w:lang w:eastAsia="hr-HR"/>
+              <w:kern w:val="2"/>
+              <w:szCs w:val="24"/>
+              <w:lang w:val="en-GB" w:eastAsia="en-GB"/>
+              <w14:ligatures w14:val="standardContextual"/>
             </w:rPr>
           </w:pPr>
-          <w:hyperlink w:anchor="_Toc232428126" w:history="1">
+          <w:hyperlink w:anchor="_Toc232881703" w:history="1">
             <w:r>
               <w:rPr>
                 <w:rStyle w:val="Hyperlink"/>
@@ -1405,7 +1415,7 @@
                 <w:noProof/>
                 <w:webHidden/>
               </w:rPr>
-              <w:instrText xml:space="preserve"> PAGEREF _Toc232428126 \h </w:instrText>
+              <w:instrText xml:space="preserve"> PAGEREF _Toc232881703 \h </w:instrText>
             </w:r>
             <w:r>
               <w:rPr>
@@ -1445,11 +1455,13 @@
             <w:rPr>
               <w:rFonts w:asciiTheme="minorHAnsi" w:eastAsiaTheme="minorEastAsia" w:hAnsiTheme="minorHAnsi"/>
               <w:noProof/>
-              <w:sz w:val="22"/>
-              <w:lang w:eastAsia="hr-HR"/>
+              <w:kern w:val="2"/>
+              <w:szCs w:val="24"/>
+              <w:lang w:val="en-GB" w:eastAsia="en-GB"/>
+              <w14:ligatures w14:val="standardContextual"/>
             </w:rPr>
           </w:pPr>
-          <w:hyperlink w:anchor="_Toc232428127" w:history="1">
+          <w:hyperlink w:anchor="_Toc232881704" w:history="1">
             <w:r>
               <w:rPr>
                 <w:rStyle w:val="Hyperlink"/>
@@ -1476,7 +1488,7 @@
                 <w:noProof/>
                 <w:webHidden/>
               </w:rPr>
-              <w:instrText xml:space="preserve"> PAGEREF _Toc232428127 \h </w:instrText>
+              <w:instrText xml:space="preserve"> PAGEREF _Toc232881704 \h </w:instrText>
             </w:r>
             <w:r>
               <w:rPr>
@@ -1516,11 +1528,13 @@
             <w:rPr>
               <w:rFonts w:asciiTheme="minorHAnsi" w:eastAsiaTheme="minorEastAsia" w:hAnsiTheme="minorHAnsi"/>
               <w:noProof/>
-              <w:sz w:val="22"/>
-              <w:lang w:eastAsia="hr-HR"/>
+              <w:kern w:val="2"/>
+              <w:szCs w:val="24"/>
+              <w:lang w:val="en-GB" w:eastAsia="en-GB"/>
+              <w14:ligatures w14:val="standardContextual"/>
             </w:rPr>
           </w:pPr>
-          <w:hyperlink w:anchor="_Toc232428128" w:history="1">
+          <w:hyperlink w:anchor="_Toc232881705" w:history="1">
             <w:r>
               <w:rPr>
                 <w:rStyle w:val="Hyperlink"/>
@@ -1547,7 +1561,7 @@
                 <w:noProof/>
                 <w:webHidden/>
               </w:rPr>
-              <w:instrText xml:space="preserve"> PAGEREF _Toc232428128 \h </w:instrText>
+              <w:instrText xml:space="preserve"> PAGEREF _Toc232881705 \h </w:instrText>
             </w:r>
             <w:r>
               <w:rPr>
@@ -1587,11 +1601,13 @@
             <w:rPr>
               <w:rFonts w:asciiTheme="minorHAnsi" w:eastAsiaTheme="minorEastAsia" w:hAnsiTheme="minorHAnsi"/>
               <w:noProof/>
-              <w:sz w:val="22"/>
-              <w:lang w:eastAsia="hr-HR"/>
+              <w:kern w:val="2"/>
+              <w:szCs w:val="24"/>
+              <w:lang w:val="en-GB" w:eastAsia="en-GB"/>
+              <w14:ligatures w14:val="standardContextual"/>
             </w:rPr>
           </w:pPr>
-          <w:hyperlink w:anchor="_Toc232428129" w:history="1">
+          <w:hyperlink w:anchor="_Toc232881706" w:history="1">
             <w:r>
               <w:rPr>
                 <w:rStyle w:val="Hyperlink"/>
@@ -1618,7 +1634,7 @@
                 <w:noProof/>
                 <w:webHidden/>
               </w:rPr>
-              <w:instrText xml:space="preserve"> PAGEREF _Toc232428129 \h </w:instrText>
+              <w:instrText xml:space="preserve"> PAGEREF _Toc232881706 \h </w:instrText>
             </w:r>
             <w:r>
               <w:rPr>
@@ -1658,17 +1674,34 @@
             <w:rPr>
               <w:rFonts w:asciiTheme="minorHAnsi" w:eastAsiaTheme="minorEastAsia" w:hAnsiTheme="minorHAnsi"/>
               <w:noProof/>
-              <w:sz w:val="22"/>
-              <w:lang w:eastAsia="hr-HR"/>
+              <w:kern w:val="2"/>
+              <w:szCs w:val="24"/>
+              <w:lang w:val="en-GB" w:eastAsia="en-GB"/>
+              <w14:ligatures w14:val="standardContextual"/>
             </w:rPr>
           </w:pPr>
-          <w:hyperlink w:anchor="_Toc232428130" w:history="1">
+          <w:hyperlink w:anchor="_Toc232881707" w:history="1">
             <w:r>
               <w:rPr>
                 <w:rStyle w:val="Hyperlink"/>
                 <w:noProof/>
               </w:rPr>
-              <w:t>2.1.3 THD (Total Harmonic Distortion)</w:t>
+              <w:t>2.1.3</w:t>
+            </w:r>
+            <w:r>
+              <w:rPr>
+                <w:rStyle w:val="Hyperlink"/>
+                <w:i/>
+                <w:noProof/>
+              </w:rPr>
+              <w:t xml:space="preserve"> THD</w:t>
+            </w:r>
+            <w:r>
+              <w:rPr>
+                <w:rStyle w:val="Hyperlink"/>
+                <w:noProof/>
+              </w:rPr>
+              <w:t xml:space="preserve"> (Total Harmonic Distortion)</w:t>
             </w:r>
             <w:r>
               <w:rPr>
@@ -1689,7 +1722,7 @@
                 <w:noProof/>
                 <w:webHidden/>
               </w:rPr>
-              <w:instrText xml:space="preserve"> PAGEREF _Toc232428130 \h </w:instrText>
+              <w:instrText xml:space="preserve"> PAGEREF _Toc232881707 \h </w:instrText>
             </w:r>
             <w:r>
               <w:rPr>
@@ -1729,17 +1762,19 @@
             <w:rPr>
               <w:rFonts w:asciiTheme="minorHAnsi" w:eastAsiaTheme="minorEastAsia" w:hAnsiTheme="minorHAnsi"/>
               <w:noProof/>
-              <w:sz w:val="22"/>
-              <w:lang w:eastAsia="hr-HR"/>
+              <w:kern w:val="2"/>
+              <w:szCs w:val="24"/>
+              <w:lang w:val="en-GB" w:eastAsia="en-GB"/>
+              <w14:ligatures w14:val="standardContextual"/>
             </w:rPr>
           </w:pPr>
-          <w:hyperlink w:anchor="_Toc232428131" w:history="1">
+          <w:hyperlink w:anchor="_Toc232881708" w:history="1">
             <w:r>
               <w:rPr>
                 <w:rStyle w:val="Hyperlink"/>
                 <w:noProof/>
               </w:rPr>
-              <w:t>2.1.4 Fourierov rastav</w:t>
+              <w:t>2.1.4 Fourierov rastav signala</w:t>
             </w:r>
             <w:r>
               <w:rPr>
@@ -1760,7 +1795,7 @@
                 <w:noProof/>
                 <w:webHidden/>
               </w:rPr>
-              <w:instrText xml:space="preserve"> PAGEREF _Toc232428131 \h </w:instrText>
+              <w:instrText xml:space="preserve"> PAGEREF _Toc232881708 \h </w:instrText>
             </w:r>
             <w:r>
               <w:rPr>
@@ -1800,11 +1835,13 @@
             <w:rPr>
               <w:rFonts w:asciiTheme="minorHAnsi" w:eastAsiaTheme="minorEastAsia" w:hAnsiTheme="minorHAnsi"/>
               <w:noProof/>
-              <w:sz w:val="22"/>
-              <w:lang w:eastAsia="hr-HR"/>
+              <w:kern w:val="2"/>
+              <w:szCs w:val="24"/>
+              <w:lang w:val="en-GB" w:eastAsia="en-GB"/>
+              <w14:ligatures w14:val="standardContextual"/>
             </w:rPr>
           </w:pPr>
-          <w:hyperlink w:anchor="_Toc232428132" w:history="1">
+          <w:hyperlink w:anchor="_Toc232881709" w:history="1">
             <w:r>
               <w:rPr>
                 <w:rStyle w:val="Hyperlink"/>
@@ -1831,7 +1868,7 @@
                 <w:noProof/>
                 <w:webHidden/>
               </w:rPr>
-              <w:instrText xml:space="preserve"> PAGEREF _Toc232428132 \h </w:instrText>
+              <w:instrText xml:space="preserve"> PAGEREF _Toc232881709 \h </w:instrText>
             </w:r>
             <w:r>
               <w:rPr>
@@ -1851,7 +1888,7 @@
                 <w:noProof/>
                 <w:webHidden/>
               </w:rPr>
-              <w:t>3</w:t>
+              <w:t>4</w:t>
             </w:r>
             <w:r>
               <w:rPr>
@@ -1871,11 +1908,13 @@
             <w:rPr>
               <w:rFonts w:asciiTheme="minorHAnsi" w:eastAsiaTheme="minorEastAsia" w:hAnsiTheme="minorHAnsi"/>
               <w:noProof/>
-              <w:sz w:val="22"/>
-              <w:lang w:eastAsia="hr-HR"/>
+              <w:kern w:val="2"/>
+              <w:szCs w:val="24"/>
+              <w:lang w:val="en-GB" w:eastAsia="en-GB"/>
+              <w14:ligatures w14:val="standardContextual"/>
             </w:rPr>
           </w:pPr>
-          <w:hyperlink w:anchor="_Toc232428133" w:history="1">
+          <w:hyperlink w:anchor="_Toc232881710" w:history="1">
             <w:r>
               <w:rPr>
                 <w:rStyle w:val="Hyperlink"/>
@@ -1902,7 +1941,7 @@
                 <w:noProof/>
                 <w:webHidden/>
               </w:rPr>
-              <w:instrText xml:space="preserve"> PAGEREF _Toc232428133 \h </w:instrText>
+              <w:instrText xml:space="preserve"> PAGEREF _Toc232881710 \h </w:instrText>
             </w:r>
             <w:r>
               <w:rPr>
@@ -1942,11 +1981,13 @@
             <w:rPr>
               <w:rFonts w:asciiTheme="minorHAnsi" w:eastAsiaTheme="minorEastAsia" w:hAnsiTheme="minorHAnsi"/>
               <w:noProof/>
-              <w:sz w:val="22"/>
-              <w:lang w:eastAsia="hr-HR"/>
+              <w:kern w:val="2"/>
+              <w:szCs w:val="24"/>
+              <w:lang w:val="en-GB" w:eastAsia="en-GB"/>
+              <w14:ligatures w14:val="standardContextual"/>
             </w:rPr>
           </w:pPr>
-          <w:hyperlink w:anchor="_Toc232428134" w:history="1">
+          <w:hyperlink w:anchor="_Toc232881711" w:history="1">
             <w:r>
               <w:rPr>
                 <w:rStyle w:val="Hyperlink"/>
@@ -1973,7 +2014,7 @@
                 <w:noProof/>
                 <w:webHidden/>
               </w:rPr>
-              <w:instrText xml:space="preserve"> PAGEREF _Toc232428134 \h </w:instrText>
+              <w:instrText xml:space="preserve"> PAGEREF _Toc232881711 \h </w:instrText>
             </w:r>
             <w:r>
               <w:rPr>
@@ -2013,11 +2054,13 @@
             <w:rPr>
               <w:rFonts w:asciiTheme="minorHAnsi" w:eastAsiaTheme="minorEastAsia" w:hAnsiTheme="minorHAnsi"/>
               <w:noProof/>
-              <w:sz w:val="22"/>
-              <w:lang w:eastAsia="hr-HR"/>
+              <w:kern w:val="2"/>
+              <w:szCs w:val="24"/>
+              <w:lang w:val="en-GB" w:eastAsia="en-GB"/>
+              <w14:ligatures w14:val="standardContextual"/>
             </w:rPr>
           </w:pPr>
-          <w:hyperlink w:anchor="_Toc232428135" w:history="1">
+          <w:hyperlink w:anchor="_Toc232881712" w:history="1">
             <w:r>
               <w:rPr>
                 <w:rStyle w:val="Hyperlink"/>
@@ -2044,7 +2087,7 @@
                 <w:noProof/>
                 <w:webHidden/>
               </w:rPr>
-              <w:instrText xml:space="preserve"> PAGEREF _Toc232428135 \h </w:instrText>
+              <w:instrText xml:space="preserve"> PAGEREF _Toc232881712 \h </w:instrText>
             </w:r>
             <w:r>
               <w:rPr>
@@ -2084,11 +2127,13 @@
             <w:rPr>
               <w:rFonts w:asciiTheme="minorHAnsi" w:eastAsiaTheme="minorEastAsia" w:hAnsiTheme="minorHAnsi"/>
               <w:noProof/>
-              <w:sz w:val="22"/>
-              <w:lang w:eastAsia="hr-HR"/>
+              <w:kern w:val="2"/>
+              <w:szCs w:val="24"/>
+              <w:lang w:val="en-GB" w:eastAsia="en-GB"/>
+              <w14:ligatures w14:val="standardContextual"/>
             </w:rPr>
           </w:pPr>
-          <w:hyperlink w:anchor="_Toc232428136" w:history="1">
+          <w:hyperlink w:anchor="_Toc232881713" w:history="1">
             <w:r>
               <w:rPr>
                 <w:rStyle w:val="Hyperlink"/>
@@ -2115,7 +2160,7 @@
                 <w:noProof/>
                 <w:webHidden/>
               </w:rPr>
-              <w:instrText xml:space="preserve"> PAGEREF _Toc232428136 \h </w:instrText>
+              <w:instrText xml:space="preserve"> PAGEREF _Toc232881713 \h </w:instrText>
             </w:r>
             <w:r>
               <w:rPr>
@@ -2155,11 +2200,13 @@
             <w:rPr>
               <w:rFonts w:asciiTheme="minorHAnsi" w:eastAsiaTheme="minorEastAsia" w:hAnsiTheme="minorHAnsi"/>
               <w:noProof/>
-              <w:sz w:val="22"/>
-              <w:lang w:eastAsia="hr-HR"/>
+              <w:kern w:val="2"/>
+              <w:szCs w:val="24"/>
+              <w:lang w:val="en-GB" w:eastAsia="en-GB"/>
+              <w14:ligatures w14:val="standardContextual"/>
             </w:rPr>
           </w:pPr>
-          <w:hyperlink w:anchor="_Toc232428137" w:history="1">
+          <w:hyperlink w:anchor="_Toc232881714" w:history="1">
             <w:r>
               <w:rPr>
                 <w:rStyle w:val="Hyperlink"/>
@@ -2186,7 +2233,7 @@
                 <w:noProof/>
                 <w:webHidden/>
               </w:rPr>
-              <w:instrText xml:space="preserve"> PAGEREF _Toc232428137 \h </w:instrText>
+              <w:instrText xml:space="preserve"> PAGEREF _Toc232881714 \h </w:instrText>
             </w:r>
             <w:r>
               <w:rPr>
@@ -2226,11 +2273,13 @@
             <w:rPr>
               <w:rFonts w:asciiTheme="minorHAnsi" w:eastAsiaTheme="minorEastAsia" w:hAnsiTheme="minorHAnsi"/>
               <w:noProof/>
-              <w:sz w:val="22"/>
-              <w:lang w:eastAsia="hr-HR"/>
+              <w:kern w:val="2"/>
+              <w:szCs w:val="24"/>
+              <w:lang w:val="en-GB" w:eastAsia="en-GB"/>
+              <w14:ligatures w14:val="standardContextual"/>
             </w:rPr>
           </w:pPr>
-          <w:hyperlink w:anchor="_Toc232428138" w:history="1">
+          <w:hyperlink w:anchor="_Toc232881715" w:history="1">
             <w:r>
               <w:rPr>
                 <w:rStyle w:val="Hyperlink"/>
@@ -2257,7 +2306,7 @@
                 <w:noProof/>
                 <w:webHidden/>
               </w:rPr>
-              <w:instrText xml:space="preserve"> PAGEREF _Toc232428138 \h </w:instrText>
+              <w:instrText xml:space="preserve"> PAGEREF _Toc232881715 \h </w:instrText>
             </w:r>
             <w:r>
               <w:rPr>
@@ -2297,17 +2346,19 @@
             <w:rPr>
               <w:rFonts w:asciiTheme="minorHAnsi" w:eastAsiaTheme="minorEastAsia" w:hAnsiTheme="minorHAnsi"/>
               <w:noProof/>
-              <w:sz w:val="22"/>
-              <w:lang w:eastAsia="hr-HR"/>
+              <w:kern w:val="2"/>
+              <w:szCs w:val="24"/>
+              <w:lang w:val="en-GB" w:eastAsia="en-GB"/>
+              <w14:ligatures w14:val="standardContextual"/>
             </w:rPr>
           </w:pPr>
-          <w:hyperlink w:anchor="_Toc232428139" w:history="1">
+          <w:hyperlink w:anchor="_Toc232881716" w:history="1">
             <w:r>
               <w:rPr>
                 <w:rStyle w:val="Hyperlink"/>
                 <w:noProof/>
               </w:rPr>
-              <w:t>2.3.1 Zašto nastaju?</w:t>
+              <w:t>2.3.1 Uzrok nastajanja</w:t>
             </w:r>
             <w:r>
               <w:rPr>
@@ -2328,24 +2379,27 @@
                 <w:noProof/>
                 <w:webHidden/>
               </w:rPr>
-              <w:instrText xml:space="preserve"> PAGEREF _Toc232428139 \h </w:instrText>
+              <w:instrText xml:space="preserve"> PAGEREF _Toc232881716 \h </w:instrText>
             </w:r>
             <w:r>
               <w:rPr>
                 <w:noProof/>
                 <w:webHidden/>
               </w:rPr>
+            </w:r>
+            <w:r>
+              <w:rPr>
+                <w:noProof/>
+                <w:webHidden/>
+              </w:rPr>
               <w:fldChar w:fldCharType="separate"/>
             </w:r>
             <w:r>
               <w:rPr>
-                <w:b/>
-                <w:bCs/>
                 <w:noProof/>
                 <w:webHidden/>
-                <w:lang w:val="en-GB"/>
-              </w:rPr>
-              <w:t>Error! Bookmark not defined.</w:t>
+              </w:rPr>
+              <w:t>5</w:t>
             </w:r>
             <w:r>
               <w:rPr>
@@ -2365,11 +2419,13 @@
             <w:rPr>
               <w:rFonts w:asciiTheme="minorHAnsi" w:eastAsiaTheme="minorEastAsia" w:hAnsiTheme="minorHAnsi"/>
               <w:noProof/>
-              <w:sz w:val="22"/>
-              <w:lang w:eastAsia="hr-HR"/>
+              <w:kern w:val="2"/>
+              <w:szCs w:val="24"/>
+              <w:lang w:val="en-GB" w:eastAsia="en-GB"/>
+              <w14:ligatures w14:val="standardContextual"/>
             </w:rPr>
           </w:pPr>
-          <w:hyperlink w:anchor="_Toc232428140" w:history="1">
+          <w:hyperlink w:anchor="_Toc232881717" w:history="1">
             <w:r>
               <w:rPr>
                 <w:rStyle w:val="Hyperlink"/>
@@ -2396,7 +2452,7 @@
                 <w:noProof/>
                 <w:webHidden/>
               </w:rPr>
-              <w:instrText xml:space="preserve"> PAGEREF _Toc232428140 \h </w:instrText>
+              <w:instrText xml:space="preserve"> PAGEREF _Toc232881717 \h </w:instrText>
             </w:r>
             <w:r>
               <w:rPr>
@@ -2436,17 +2492,19 @@
             <w:rPr>
               <w:rFonts w:asciiTheme="minorHAnsi" w:eastAsiaTheme="minorEastAsia" w:hAnsiTheme="minorHAnsi"/>
               <w:noProof/>
-              <w:sz w:val="22"/>
-              <w:lang w:eastAsia="hr-HR"/>
+              <w:kern w:val="2"/>
+              <w:szCs w:val="24"/>
+              <w:lang w:val="en-GB" w:eastAsia="en-GB"/>
+              <w14:ligatures w14:val="standardContextual"/>
             </w:rPr>
           </w:pPr>
-          <w:hyperlink w:anchor="_Toc232428141" w:history="1">
+          <w:hyperlink w:anchor="_Toc232881718" w:history="1">
             <w:r>
               <w:rPr>
                 <w:rStyle w:val="Hyperlink"/>
                 <w:noProof/>
               </w:rPr>
-              <w:t>2.3.3 Mane signala s harmonijskim izobličenjima</w:t>
+              <w:t>2.3.3 Mane harmonijskog izobličenja</w:t>
             </w:r>
             <w:r>
               <w:rPr>
@@ -2467,7 +2525,7 @@
                 <w:noProof/>
                 <w:webHidden/>
               </w:rPr>
-              <w:instrText xml:space="preserve"> PAGEREF _Toc232428141 \h </w:instrText>
+              <w:instrText xml:space="preserve"> PAGEREF _Toc232881718 \h </w:instrText>
             </w:r>
             <w:r>
               <w:rPr>
@@ -2507,11 +2565,13 @@
             <w:rPr>
               <w:rFonts w:asciiTheme="minorHAnsi" w:eastAsiaTheme="minorEastAsia" w:hAnsiTheme="minorHAnsi"/>
               <w:noProof/>
-              <w:sz w:val="22"/>
-              <w:lang w:eastAsia="hr-HR"/>
+              <w:kern w:val="2"/>
+              <w:szCs w:val="24"/>
+              <w:lang w:val="en-GB" w:eastAsia="en-GB"/>
+              <w14:ligatures w14:val="standardContextual"/>
             </w:rPr>
           </w:pPr>
-          <w:hyperlink w:anchor="_Toc232428142" w:history="1">
+          <w:hyperlink w:anchor="_Toc232881719" w:history="1">
             <w:r>
               <w:rPr>
                 <w:rStyle w:val="Hyperlink"/>
@@ -2538,7 +2598,7 @@
                 <w:noProof/>
                 <w:webHidden/>
               </w:rPr>
-              <w:instrText xml:space="preserve"> PAGEREF _Toc232428142 \h </w:instrText>
+              <w:instrText xml:space="preserve"> PAGEREF _Toc232881719 \h </w:instrText>
             </w:r>
             <w:r>
               <w:rPr>
@@ -2578,11 +2638,13 @@
             <w:rPr>
               <w:rFonts w:asciiTheme="minorHAnsi" w:eastAsiaTheme="minorEastAsia" w:hAnsiTheme="minorHAnsi"/>
               <w:noProof/>
-              <w:sz w:val="22"/>
-              <w:lang w:eastAsia="hr-HR"/>
+              <w:kern w:val="2"/>
+              <w:szCs w:val="24"/>
+              <w:lang w:val="en-GB" w:eastAsia="en-GB"/>
+              <w14:ligatures w14:val="standardContextual"/>
             </w:rPr>
           </w:pPr>
-          <w:hyperlink w:anchor="_Toc232428143" w:history="1">
+          <w:hyperlink w:anchor="_Toc232881720" w:history="1">
             <w:r>
               <w:rPr>
                 <w:rStyle w:val="Hyperlink"/>
@@ -2609,7 +2671,7 @@
                 <w:noProof/>
                 <w:webHidden/>
               </w:rPr>
-              <w:instrText xml:space="preserve"> PAGEREF _Toc232428143 \h </w:instrText>
+              <w:instrText xml:space="preserve"> PAGEREF _Toc232881720 \h </w:instrText>
             </w:r>
             <w:r>
               <w:rPr>
@@ -2646,11 +2708,13 @@
             <w:rPr>
               <w:rFonts w:asciiTheme="minorHAnsi" w:eastAsiaTheme="minorEastAsia" w:hAnsiTheme="minorHAnsi"/>
               <w:noProof/>
-              <w:sz w:val="22"/>
-              <w:lang w:eastAsia="hr-HR"/>
+              <w:kern w:val="2"/>
+              <w:szCs w:val="24"/>
+              <w:lang w:val="en-GB" w:eastAsia="en-GB"/>
+              <w14:ligatures w14:val="standardContextual"/>
             </w:rPr>
           </w:pPr>
-          <w:hyperlink w:anchor="_Toc232428144" w:history="1">
+          <w:hyperlink w:anchor="_Toc232881721" w:history="1">
             <w:r>
               <w:rPr>
                 <w:rStyle w:val="Hyperlink"/>
@@ -2677,7 +2741,7 @@
                 <w:noProof/>
                 <w:webHidden/>
               </w:rPr>
-              <w:instrText xml:space="preserve"> PAGEREF _Toc232428144 \h </w:instrText>
+              <w:instrText xml:space="preserve"> PAGEREF _Toc232881721 \h </w:instrText>
             </w:r>
             <w:r>
               <w:rPr>
@@ -2717,11 +2781,13 @@
             <w:rPr>
               <w:rFonts w:asciiTheme="minorHAnsi" w:eastAsiaTheme="minorEastAsia" w:hAnsiTheme="minorHAnsi"/>
               <w:noProof/>
-              <w:sz w:val="22"/>
-              <w:lang w:eastAsia="hr-HR"/>
+              <w:kern w:val="2"/>
+              <w:szCs w:val="24"/>
+              <w:lang w:val="en-GB" w:eastAsia="en-GB"/>
+              <w14:ligatures w14:val="standardContextual"/>
             </w:rPr>
           </w:pPr>
-          <w:hyperlink w:anchor="_Toc232428145" w:history="1">
+          <w:hyperlink w:anchor="_Toc232881722" w:history="1">
             <w:r>
               <w:rPr>
                 <w:rStyle w:val="Hyperlink"/>
@@ -2748,7 +2814,7 @@
                 <w:noProof/>
                 <w:webHidden/>
               </w:rPr>
-              <w:instrText xml:space="preserve"> PAGEREF _Toc232428145 \h </w:instrText>
+              <w:instrText xml:space="preserve"> PAGEREF _Toc232881722 \h </w:instrText>
             </w:r>
             <w:r>
               <w:rPr>
@@ -2788,17 +2854,19 @@
             <w:rPr>
               <w:rFonts w:asciiTheme="minorHAnsi" w:eastAsiaTheme="minorEastAsia" w:hAnsiTheme="minorHAnsi"/>
               <w:noProof/>
-              <w:sz w:val="22"/>
-              <w:lang w:eastAsia="hr-HR"/>
+              <w:kern w:val="2"/>
+              <w:szCs w:val="24"/>
+              <w:lang w:val="en-GB" w:eastAsia="en-GB"/>
+              <w14:ligatures w14:val="standardContextual"/>
             </w:rPr>
           </w:pPr>
-          <w:hyperlink w:anchor="_Toc232428146" w:history="1">
+          <w:hyperlink w:anchor="_Toc232881723" w:history="1">
             <w:r>
               <w:rPr>
                 <w:rStyle w:val="Hyperlink"/>
                 <w:noProof/>
               </w:rPr>
-              <w:t>3.1.1 Shema pojčala</w:t>
+              <w:t>3.1.1 Shema pojačala</w:t>
             </w:r>
             <w:r>
               <w:rPr>
@@ -2819,7 +2887,7 @@
                 <w:noProof/>
                 <w:webHidden/>
               </w:rPr>
-              <w:instrText xml:space="preserve"> PAGEREF _Toc232428146 \h </w:instrText>
+              <w:instrText xml:space="preserve"> PAGEREF _Toc232881723 \h </w:instrText>
             </w:r>
             <w:r>
               <w:rPr>
@@ -2859,11 +2927,13 @@
             <w:rPr>
               <w:rFonts w:asciiTheme="minorHAnsi" w:eastAsiaTheme="minorEastAsia" w:hAnsiTheme="minorHAnsi"/>
               <w:noProof/>
-              <w:sz w:val="22"/>
-              <w:lang w:eastAsia="hr-HR"/>
+              <w:kern w:val="2"/>
+              <w:szCs w:val="24"/>
+              <w:lang w:val="en-GB" w:eastAsia="en-GB"/>
+              <w14:ligatures w14:val="standardContextual"/>
             </w:rPr>
           </w:pPr>
-          <w:hyperlink w:anchor="_Toc232428147" w:history="1">
+          <w:hyperlink w:anchor="_Toc232881724" w:history="1">
             <w:r>
               <w:rPr>
                 <w:rStyle w:val="Hyperlink"/>
@@ -2890,7 +2960,7 @@
                 <w:noProof/>
                 <w:webHidden/>
               </w:rPr>
-              <w:instrText xml:space="preserve"> PAGEREF _Toc232428147 \h </w:instrText>
+              <w:instrText xml:space="preserve"> PAGEREF _Toc232881724 \h </w:instrText>
             </w:r>
             <w:r>
               <w:rPr>
@@ -2930,11 +3000,13 @@
             <w:rPr>
               <w:rFonts w:asciiTheme="minorHAnsi" w:eastAsiaTheme="minorEastAsia" w:hAnsiTheme="minorHAnsi"/>
               <w:noProof/>
-              <w:sz w:val="22"/>
-              <w:lang w:eastAsia="hr-HR"/>
+              <w:kern w:val="2"/>
+              <w:szCs w:val="24"/>
+              <w:lang w:val="en-GB" w:eastAsia="en-GB"/>
+              <w14:ligatures w14:val="standardContextual"/>
             </w:rPr>
           </w:pPr>
-          <w:hyperlink w:anchor="_Toc232428148" w:history="1">
+          <w:hyperlink w:anchor="_Toc232881725" w:history="1">
             <w:r>
               <w:rPr>
                 <w:rStyle w:val="Hyperlink"/>
@@ -2961,7 +3033,7 @@
                 <w:noProof/>
                 <w:webHidden/>
               </w:rPr>
-              <w:instrText xml:space="preserve"> PAGEREF _Toc232428148 \h </w:instrText>
+              <w:instrText xml:space="preserve"> PAGEREF _Toc232881725 \h </w:instrText>
             </w:r>
             <w:r>
               <w:rPr>
@@ -3001,11 +3073,13 @@
             <w:rPr>
               <w:rFonts w:asciiTheme="minorHAnsi" w:eastAsiaTheme="minorEastAsia" w:hAnsiTheme="minorHAnsi"/>
               <w:noProof/>
-              <w:sz w:val="22"/>
-              <w:lang w:eastAsia="hr-HR"/>
+              <w:kern w:val="2"/>
+              <w:szCs w:val="24"/>
+              <w:lang w:val="en-GB" w:eastAsia="en-GB"/>
+              <w14:ligatures w14:val="standardContextual"/>
             </w:rPr>
           </w:pPr>
-          <w:hyperlink w:anchor="_Toc232428149" w:history="1">
+          <w:hyperlink w:anchor="_Toc232881726" w:history="1">
             <w:r>
               <w:rPr>
                 <w:rStyle w:val="Hyperlink"/>
@@ -3032,7 +3106,7 @@
                 <w:noProof/>
                 <w:webHidden/>
               </w:rPr>
-              <w:instrText xml:space="preserve"> PAGEREF _Toc232428149 \h </w:instrText>
+              <w:instrText xml:space="preserve"> PAGEREF _Toc232881726 \h </w:instrText>
             </w:r>
             <w:r>
               <w:rPr>
@@ -3072,11 +3146,13 @@
             <w:rPr>
               <w:rFonts w:asciiTheme="minorHAnsi" w:eastAsiaTheme="minorEastAsia" w:hAnsiTheme="minorHAnsi"/>
               <w:noProof/>
-              <w:sz w:val="22"/>
-              <w:lang w:eastAsia="hr-HR"/>
+              <w:kern w:val="2"/>
+              <w:szCs w:val="24"/>
+              <w:lang w:val="en-GB" w:eastAsia="en-GB"/>
+              <w14:ligatures w14:val="standardContextual"/>
             </w:rPr>
           </w:pPr>
-          <w:hyperlink w:anchor="_Toc232428150" w:history="1">
+          <w:hyperlink w:anchor="_Toc232881727" w:history="1">
             <w:r>
               <w:rPr>
                 <w:rStyle w:val="Hyperlink"/>
@@ -3103,7 +3179,7 @@
                 <w:noProof/>
                 <w:webHidden/>
               </w:rPr>
-              <w:instrText xml:space="preserve"> PAGEREF _Toc232428150 \h </w:instrText>
+              <w:instrText xml:space="preserve"> PAGEREF _Toc232881727 \h </w:instrText>
             </w:r>
             <w:r>
               <w:rPr>
@@ -3143,11 +3219,13 @@
             <w:rPr>
               <w:rFonts w:asciiTheme="minorHAnsi" w:eastAsiaTheme="minorEastAsia" w:hAnsiTheme="minorHAnsi"/>
               <w:noProof/>
-              <w:sz w:val="22"/>
-              <w:lang w:eastAsia="hr-HR"/>
+              <w:kern w:val="2"/>
+              <w:szCs w:val="24"/>
+              <w:lang w:val="en-GB" w:eastAsia="en-GB"/>
+              <w14:ligatures w14:val="standardContextual"/>
             </w:rPr>
           </w:pPr>
-          <w:hyperlink w:anchor="_Toc232428151" w:history="1">
+          <w:hyperlink w:anchor="_Toc232881728" w:history="1">
             <w:r>
               <w:rPr>
                 <w:rStyle w:val="Hyperlink"/>
@@ -3174,7 +3252,7 @@
                 <w:noProof/>
                 <w:webHidden/>
               </w:rPr>
-              <w:instrText xml:space="preserve"> PAGEREF _Toc232428151 \h </w:instrText>
+              <w:instrText xml:space="preserve"> PAGEREF _Toc232881728 \h </w:instrText>
             </w:r>
             <w:r>
               <w:rPr>
@@ -3214,11 +3292,13 @@
             <w:rPr>
               <w:rFonts w:asciiTheme="minorHAnsi" w:eastAsiaTheme="minorEastAsia" w:hAnsiTheme="minorHAnsi"/>
               <w:noProof/>
-              <w:sz w:val="22"/>
-              <w:lang w:eastAsia="hr-HR"/>
+              <w:kern w:val="2"/>
+              <w:szCs w:val="24"/>
+              <w:lang w:val="en-GB" w:eastAsia="en-GB"/>
+              <w14:ligatures w14:val="standardContextual"/>
             </w:rPr>
           </w:pPr>
-          <w:hyperlink w:anchor="_Toc232428152" w:history="1">
+          <w:hyperlink w:anchor="_Toc232881729" w:history="1">
             <w:r>
               <w:rPr>
                 <w:rStyle w:val="Hyperlink"/>
@@ -3245,7 +3325,7 @@
                 <w:noProof/>
                 <w:webHidden/>
               </w:rPr>
-              <w:instrText xml:space="preserve"> PAGEREF _Toc232428152 \h </w:instrText>
+              <w:instrText xml:space="preserve"> PAGEREF _Toc232881729 \h </w:instrText>
             </w:r>
             <w:r>
               <w:rPr>
@@ -3285,11 +3365,13 @@
             <w:rPr>
               <w:rFonts w:asciiTheme="minorHAnsi" w:eastAsiaTheme="minorEastAsia" w:hAnsiTheme="minorHAnsi"/>
               <w:noProof/>
-              <w:sz w:val="22"/>
-              <w:lang w:eastAsia="hr-HR"/>
+              <w:kern w:val="2"/>
+              <w:szCs w:val="24"/>
+              <w:lang w:val="en-GB" w:eastAsia="en-GB"/>
+              <w14:ligatures w14:val="standardContextual"/>
             </w:rPr>
           </w:pPr>
-          <w:hyperlink w:anchor="_Toc232428153" w:history="1">
+          <w:hyperlink w:anchor="_Toc232881730" w:history="1">
             <w:r>
               <w:rPr>
                 <w:rStyle w:val="Hyperlink"/>
@@ -3316,7 +3398,7 @@
                 <w:noProof/>
                 <w:webHidden/>
               </w:rPr>
-              <w:instrText xml:space="preserve"> PAGEREF _Toc232428153 \h </w:instrText>
+              <w:instrText xml:space="preserve"> PAGEREF _Toc232881730 \h </w:instrText>
             </w:r>
             <w:r>
               <w:rPr>
@@ -3356,11 +3438,13 @@
             <w:rPr>
               <w:rFonts w:asciiTheme="minorHAnsi" w:eastAsiaTheme="minorEastAsia" w:hAnsiTheme="minorHAnsi"/>
               <w:noProof/>
-              <w:sz w:val="22"/>
-              <w:lang w:eastAsia="hr-HR"/>
+              <w:kern w:val="2"/>
+              <w:szCs w:val="24"/>
+              <w:lang w:val="en-GB" w:eastAsia="en-GB"/>
+              <w14:ligatures w14:val="standardContextual"/>
             </w:rPr>
           </w:pPr>
-          <w:hyperlink w:anchor="_Toc232428154" w:history="1">
+          <w:hyperlink w:anchor="_Toc232881731" w:history="1">
             <w:r>
               <w:rPr>
                 <w:rStyle w:val="Hyperlink"/>
@@ -3387,7 +3471,7 @@
                 <w:noProof/>
                 <w:webHidden/>
               </w:rPr>
-              <w:instrText xml:space="preserve"> PAGEREF _Toc232428154 \h </w:instrText>
+              <w:instrText xml:space="preserve"> PAGEREF _Toc232881731 \h </w:instrText>
             </w:r>
             <w:r>
               <w:rPr>
@@ -3427,11 +3511,13 @@
             <w:rPr>
               <w:rFonts w:asciiTheme="minorHAnsi" w:eastAsiaTheme="minorEastAsia" w:hAnsiTheme="minorHAnsi"/>
               <w:noProof/>
-              <w:sz w:val="22"/>
-              <w:lang w:eastAsia="hr-HR"/>
+              <w:kern w:val="2"/>
+              <w:szCs w:val="24"/>
+              <w:lang w:val="en-GB" w:eastAsia="en-GB"/>
+              <w14:ligatures w14:val="standardContextual"/>
             </w:rPr>
           </w:pPr>
-          <w:hyperlink w:anchor="_Toc232428155" w:history="1">
+          <w:hyperlink w:anchor="_Toc232881732" w:history="1">
             <w:r>
               <w:rPr>
                 <w:rStyle w:val="Hyperlink"/>
@@ -3458,7 +3544,7 @@
                 <w:noProof/>
                 <w:webHidden/>
               </w:rPr>
-              <w:instrText xml:space="preserve"> PAGEREF _Toc232428155 \h </w:instrText>
+              <w:instrText xml:space="preserve"> PAGEREF _Toc232881732 \h </w:instrText>
             </w:r>
             <w:r>
               <w:rPr>
@@ -3498,11 +3584,13 @@
             <w:rPr>
               <w:rFonts w:asciiTheme="minorHAnsi" w:eastAsiaTheme="minorEastAsia" w:hAnsiTheme="minorHAnsi"/>
               <w:noProof/>
-              <w:sz w:val="22"/>
-              <w:lang w:eastAsia="hr-HR"/>
+              <w:kern w:val="2"/>
+              <w:szCs w:val="24"/>
+              <w:lang w:val="en-GB" w:eastAsia="en-GB"/>
+              <w14:ligatures w14:val="standardContextual"/>
             </w:rPr>
           </w:pPr>
-          <w:hyperlink w:anchor="_Toc232428156" w:history="1">
+          <w:hyperlink w:anchor="_Toc232881733" w:history="1">
             <w:r>
               <w:rPr>
                 <w:rStyle w:val="Hyperlink"/>
@@ -3529,7 +3617,7 @@
                 <w:noProof/>
                 <w:webHidden/>
               </w:rPr>
-              <w:instrText xml:space="preserve"> PAGEREF _Toc232428156 \h </w:instrText>
+              <w:instrText xml:space="preserve"> PAGEREF _Toc232881733 \h </w:instrText>
             </w:r>
             <w:r>
               <w:rPr>
@@ -3569,11 +3657,13 @@
             <w:rPr>
               <w:rFonts w:asciiTheme="minorHAnsi" w:eastAsiaTheme="minorEastAsia" w:hAnsiTheme="minorHAnsi"/>
               <w:noProof/>
-              <w:sz w:val="22"/>
-              <w:lang w:eastAsia="hr-HR"/>
+              <w:kern w:val="2"/>
+              <w:szCs w:val="24"/>
+              <w:lang w:val="en-GB" w:eastAsia="en-GB"/>
+              <w14:ligatures w14:val="standardContextual"/>
             </w:rPr>
           </w:pPr>
-          <w:hyperlink w:anchor="_Toc232428157" w:history="1">
+          <w:hyperlink w:anchor="_Toc232881734" w:history="1">
             <w:r>
               <w:rPr>
                 <w:rStyle w:val="Hyperlink"/>
@@ -3600,7 +3690,7 @@
                 <w:noProof/>
                 <w:webHidden/>
               </w:rPr>
-              <w:instrText xml:space="preserve"> PAGEREF _Toc232428157 \h </w:instrText>
+              <w:instrText xml:space="preserve"> PAGEREF _Toc232881734 \h </w:instrText>
             </w:r>
             <w:r>
               <w:rPr>
@@ -3637,17 +3727,19 @@
             <w:rPr>
               <w:rFonts w:asciiTheme="minorHAnsi" w:eastAsiaTheme="minorEastAsia" w:hAnsiTheme="minorHAnsi"/>
               <w:noProof/>
-              <w:sz w:val="22"/>
-              <w:lang w:eastAsia="hr-HR"/>
+              <w:kern w:val="2"/>
+              <w:szCs w:val="24"/>
+              <w:lang w:val="en-GB" w:eastAsia="en-GB"/>
+              <w14:ligatures w14:val="standardContextual"/>
             </w:rPr>
           </w:pPr>
-          <w:hyperlink w:anchor="_Toc232428158" w:history="1">
+          <w:hyperlink w:anchor="_Toc232881735" w:history="1">
             <w:r>
               <w:rPr>
                 <w:rStyle w:val="Hyperlink"/>
                 <w:noProof/>
               </w:rPr>
-              <w:t>4 Simulacija</w:t>
+              <w:t>4 Rezultati simulacija</w:t>
             </w:r>
             <w:r>
               <w:rPr>
@@ -3668,24 +3760,319 @@
                 <w:noProof/>
                 <w:webHidden/>
               </w:rPr>
-              <w:instrText xml:space="preserve"> PAGEREF _Toc232428158 \h </w:instrText>
+              <w:instrText xml:space="preserve"> PAGEREF _Toc232881735 \h </w:instrText>
             </w:r>
             <w:r>
               <w:rPr>
                 <w:noProof/>
                 <w:webHidden/>
               </w:rPr>
+            </w:r>
+            <w:r>
+              <w:rPr>
+                <w:noProof/>
+                <w:webHidden/>
+              </w:rPr>
               <w:fldChar w:fldCharType="separate"/>
             </w:r>
             <w:r>
               <w:rPr>
-                <w:b/>
-                <w:bCs/>
                 <w:noProof/>
                 <w:webHidden/>
-                <w:lang w:val="en-GB"/>
-              </w:rPr>
-              <w:t>Error! Bookmark not defined.</w:t>
+              </w:rPr>
+              <w:t>17</w:t>
+            </w:r>
+            <w:r>
+              <w:rPr>
+                <w:noProof/>
+                <w:webHidden/>
+              </w:rPr>
+              <w:fldChar w:fldCharType="end"/>
+            </w:r>
+          </w:hyperlink>
+        </w:p>
+        <w:p>
+          <w:pPr>
+            <w:pStyle w:val="TOC2"/>
+            <w:tabs>
+              <w:tab w:val="right" w:leader="dot" w:pos="8493"/>
+            </w:tabs>
+            <w:rPr>
+              <w:rFonts w:asciiTheme="minorHAnsi" w:eastAsiaTheme="minorEastAsia" w:hAnsiTheme="minorHAnsi"/>
+              <w:noProof/>
+              <w:kern w:val="2"/>
+              <w:szCs w:val="24"/>
+              <w:lang w:val="en-GB" w:eastAsia="en-GB"/>
+              <w14:ligatures w14:val="standardContextual"/>
+            </w:rPr>
+          </w:pPr>
+          <w:hyperlink w:anchor="_Toc232881736" w:history="1">
+            <w:r>
+              <w:rPr>
+                <w:rStyle w:val="Hyperlink"/>
+                <w:noProof/>
+              </w:rPr>
+              <w:t>4.1 Pojačalo klase A (SZC)</w:t>
+            </w:r>
+            <w:r>
+              <w:rPr>
+                <w:noProof/>
+                <w:webHidden/>
+              </w:rPr>
+              <w:tab/>
+            </w:r>
+            <w:r>
+              <w:rPr>
+                <w:noProof/>
+                <w:webHidden/>
+              </w:rPr>
+              <w:fldChar w:fldCharType="begin"/>
+            </w:r>
+            <w:r>
+              <w:rPr>
+                <w:noProof/>
+                <w:webHidden/>
+              </w:rPr>
+              <w:instrText xml:space="preserve"> PAGEREF _Toc232881736 \h </w:instrText>
+            </w:r>
+            <w:r>
+              <w:rPr>
+                <w:noProof/>
+                <w:webHidden/>
+              </w:rPr>
+            </w:r>
+            <w:r>
+              <w:rPr>
+                <w:noProof/>
+                <w:webHidden/>
+              </w:rPr>
+              <w:fldChar w:fldCharType="separate"/>
+            </w:r>
+            <w:r>
+              <w:rPr>
+                <w:noProof/>
+                <w:webHidden/>
+              </w:rPr>
+              <w:t>17</w:t>
+            </w:r>
+            <w:r>
+              <w:rPr>
+                <w:noProof/>
+                <w:webHidden/>
+              </w:rPr>
+              <w:fldChar w:fldCharType="end"/>
+            </w:r>
+          </w:hyperlink>
+        </w:p>
+        <w:p>
+          <w:pPr>
+            <w:pStyle w:val="TOC2"/>
+            <w:tabs>
+              <w:tab w:val="right" w:leader="dot" w:pos="8493"/>
+            </w:tabs>
+            <w:rPr>
+              <w:rFonts w:asciiTheme="minorHAnsi" w:eastAsiaTheme="minorEastAsia" w:hAnsiTheme="minorHAnsi"/>
+              <w:noProof/>
+              <w:kern w:val="2"/>
+              <w:szCs w:val="24"/>
+              <w:lang w:val="en-GB" w:eastAsia="en-GB"/>
+              <w14:ligatures w14:val="standardContextual"/>
+            </w:rPr>
+          </w:pPr>
+          <w:hyperlink w:anchor="_Toc232881737" w:history="1">
+            <w:r>
+              <w:rPr>
+                <w:rStyle w:val="Hyperlink"/>
+                <w:noProof/>
+              </w:rPr>
+              <w:t>4.2 Pojačalo klase B</w:t>
+            </w:r>
+            <w:r>
+              <w:rPr>
+                <w:noProof/>
+                <w:webHidden/>
+              </w:rPr>
+              <w:tab/>
+            </w:r>
+            <w:r>
+              <w:rPr>
+                <w:noProof/>
+                <w:webHidden/>
+              </w:rPr>
+              <w:fldChar w:fldCharType="begin"/>
+            </w:r>
+            <w:r>
+              <w:rPr>
+                <w:noProof/>
+                <w:webHidden/>
+              </w:rPr>
+              <w:instrText xml:space="preserve"> PAGEREF _Toc232881737 \h </w:instrText>
+            </w:r>
+            <w:r>
+              <w:rPr>
+                <w:noProof/>
+                <w:webHidden/>
+              </w:rPr>
+            </w:r>
+            <w:r>
+              <w:rPr>
+                <w:noProof/>
+                <w:webHidden/>
+              </w:rPr>
+              <w:fldChar w:fldCharType="separate"/>
+            </w:r>
+            <w:r>
+              <w:rPr>
+                <w:noProof/>
+                <w:webHidden/>
+              </w:rPr>
+              <w:t>18</w:t>
+            </w:r>
+            <w:r>
+              <w:rPr>
+                <w:noProof/>
+                <w:webHidden/>
+              </w:rPr>
+              <w:fldChar w:fldCharType="end"/>
+            </w:r>
+          </w:hyperlink>
+        </w:p>
+        <w:p>
+          <w:pPr>
+            <w:pStyle w:val="TOC2"/>
+            <w:tabs>
+              <w:tab w:val="right" w:leader="dot" w:pos="8493"/>
+            </w:tabs>
+            <w:rPr>
+              <w:rFonts w:asciiTheme="minorHAnsi" w:eastAsiaTheme="minorEastAsia" w:hAnsiTheme="minorHAnsi"/>
+              <w:noProof/>
+              <w:kern w:val="2"/>
+              <w:szCs w:val="24"/>
+              <w:lang w:val="en-GB" w:eastAsia="en-GB"/>
+              <w14:ligatures w14:val="standardContextual"/>
+            </w:rPr>
+          </w:pPr>
+          <w:hyperlink w:anchor="_Toc232881738" w:history="1">
+            <w:r>
+              <w:rPr>
+                <w:rStyle w:val="Hyperlink"/>
+                <w:noProof/>
+              </w:rPr>
+              <w:t>4.3 Pojačalo klase AB</w:t>
+            </w:r>
+            <w:r>
+              <w:rPr>
+                <w:noProof/>
+                <w:webHidden/>
+              </w:rPr>
+              <w:tab/>
+            </w:r>
+            <w:r>
+              <w:rPr>
+                <w:noProof/>
+                <w:webHidden/>
+              </w:rPr>
+              <w:fldChar w:fldCharType="begin"/>
+            </w:r>
+            <w:r>
+              <w:rPr>
+                <w:noProof/>
+                <w:webHidden/>
+              </w:rPr>
+              <w:instrText xml:space="preserve"> PAGEREF _Toc232881738 \h </w:instrText>
+            </w:r>
+            <w:r>
+              <w:rPr>
+                <w:noProof/>
+                <w:webHidden/>
+              </w:rPr>
+            </w:r>
+            <w:r>
+              <w:rPr>
+                <w:noProof/>
+                <w:webHidden/>
+              </w:rPr>
+              <w:fldChar w:fldCharType="separate"/>
+            </w:r>
+            <w:r>
+              <w:rPr>
+                <w:noProof/>
+                <w:webHidden/>
+              </w:rPr>
+              <w:t>18</w:t>
+            </w:r>
+            <w:r>
+              <w:rPr>
+                <w:noProof/>
+                <w:webHidden/>
+              </w:rPr>
+              <w:fldChar w:fldCharType="end"/>
+            </w:r>
+          </w:hyperlink>
+        </w:p>
+        <w:p>
+          <w:pPr>
+            <w:pStyle w:val="TOC2"/>
+            <w:tabs>
+              <w:tab w:val="right" w:leader="dot" w:pos="8493"/>
+            </w:tabs>
+            <w:rPr>
+              <w:rFonts w:asciiTheme="minorHAnsi" w:eastAsiaTheme="minorEastAsia" w:hAnsiTheme="minorHAnsi"/>
+              <w:noProof/>
+              <w:kern w:val="2"/>
+              <w:szCs w:val="24"/>
+              <w:lang w:val="en-GB" w:eastAsia="en-GB"/>
+              <w14:ligatures w14:val="standardContextual"/>
+            </w:rPr>
+          </w:pPr>
+          <w:hyperlink w:anchor="_Toc232881739" w:history="1">
+            <w:r>
+              <w:rPr>
+                <w:rStyle w:val="Hyperlink"/>
+                <w:noProof/>
+              </w:rPr>
+              <w:t>4.4 Usporedba rezultata proračuna i simulacije</w:t>
+            </w:r>
+            <w:r>
+              <w:rPr>
+                <w:noProof/>
+                <w:webHidden/>
+              </w:rPr>
+              <w:tab/>
+            </w:r>
+            <w:r>
+              <w:rPr>
+                <w:noProof/>
+                <w:webHidden/>
+              </w:rPr>
+              <w:fldChar w:fldCharType="begin"/>
+            </w:r>
+            <w:r>
+              <w:rPr>
+                <w:noProof/>
+                <w:webHidden/>
+              </w:rPr>
+              <w:instrText xml:space="preserve"> PAGEREF _Toc232881739 \h </w:instrText>
+            </w:r>
+            <w:r>
+              <w:rPr>
+                <w:noProof/>
+                <w:webHidden/>
+              </w:rPr>
+            </w:r>
+            <w:r>
+              <w:rPr>
+                <w:noProof/>
+                <w:webHidden/>
+              </w:rPr>
+              <w:fldChar w:fldCharType="separate"/>
+            </w:r>
+            <w:r>
+              <w:rPr>
+                <w:noProof/>
+                <w:webHidden/>
+              </w:rPr>
+              <w:t>18</w:t>
             </w:r>
             <w:r>
               <w:rPr>
@@ -3702,17 +4089,19 @@
             <w:rPr>
               <w:rFonts w:asciiTheme="minorHAnsi" w:eastAsiaTheme="minorEastAsia" w:hAnsiTheme="minorHAnsi"/>
               <w:noProof/>
-              <w:sz w:val="22"/>
-              <w:lang w:eastAsia="hr-HR"/>
+              <w:kern w:val="2"/>
+              <w:szCs w:val="24"/>
+              <w:lang w:val="en-GB" w:eastAsia="en-GB"/>
+              <w14:ligatures w14:val="standardContextual"/>
             </w:rPr>
           </w:pPr>
-          <w:hyperlink w:anchor="_Toc232428159" w:history="1">
+          <w:hyperlink w:anchor="_Toc232881740" w:history="1">
             <w:r>
               <w:rPr>
                 <w:rStyle w:val="Hyperlink"/>
                 <w:noProof/>
               </w:rPr>
-              <w:t>2. Sklopovska podrška</w:t>
+              <w:t>5 Rezultati mjerenja</w:t>
             </w:r>
             <w:r>
               <w:rPr>
@@ -3733,24 +4122,27 @@
                 <w:noProof/>
                 <w:webHidden/>
               </w:rPr>
-              <w:instrText xml:space="preserve"> PAGEREF _Toc232428159 \h </w:instrText>
+              <w:instrText xml:space="preserve"> PAGEREF _Toc232881740 \h </w:instrText>
             </w:r>
             <w:r>
               <w:rPr>
                 <w:noProof/>
                 <w:webHidden/>
               </w:rPr>
+            </w:r>
+            <w:r>
+              <w:rPr>
+                <w:noProof/>
+                <w:webHidden/>
+              </w:rPr>
               <w:fldChar w:fldCharType="separate"/>
             </w:r>
             <w:r>
               <w:rPr>
-                <w:b/>
-                <w:bCs/>
                 <w:noProof/>
                 <w:webHidden/>
-                <w:lang w:val="en-GB"/>
-              </w:rPr>
-              <w:t>Error! Bookmark not defined.</w:t>
+              </w:rPr>
+              <w:t>18</w:t>
             </w:r>
             <w:r>
               <w:rPr>
@@ -3765,60 +4157,51 @@
           <w:pPr>
             <w:pStyle w:val="TOC2"/>
             <w:tabs>
-              <w:tab w:val="left" w:pos="880"/>
               <w:tab w:val="right" w:leader="dot" w:pos="8493"/>
             </w:tabs>
             <w:rPr>
               <w:rFonts w:asciiTheme="minorHAnsi" w:eastAsiaTheme="minorEastAsia" w:hAnsiTheme="minorHAnsi"/>
               <w:noProof/>
-              <w:sz w:val="22"/>
-              <w:lang w:eastAsia="hr-HR"/>
+              <w:kern w:val="2"/>
+              <w:szCs w:val="24"/>
+              <w:lang w:val="en-GB" w:eastAsia="en-GB"/>
+              <w14:ligatures w14:val="standardContextual"/>
             </w:rPr>
           </w:pPr>
-          <w:hyperlink w:anchor="_Toc232428160" w:history="1">
+          <w:hyperlink w:anchor="_Toc232881741" w:history="1">
             <w:r>
               <w:rPr>
                 <w:rStyle w:val="Hyperlink"/>
                 <w:noProof/>
               </w:rPr>
-              <w:t>2.1.</w:t>
-            </w:r>
-            <w:r>
-              <w:rPr>
-                <w:rFonts w:asciiTheme="minorHAnsi" w:eastAsiaTheme="minorEastAsia" w:hAnsiTheme="minorHAnsi"/>
-                <w:noProof/>
-                <w:sz w:val="22"/>
-                <w:lang w:eastAsia="hr-HR"/>
+              <w:t>5.1 Pojačalo klase A (SZC)</w:t>
+            </w:r>
+            <w:r>
+              <w:rPr>
+                <w:noProof/>
+                <w:webHidden/>
               </w:rPr>
               <w:tab/>
             </w:r>
             <w:r>
               <w:rPr>
-                <w:rStyle w:val="Hyperlink"/>
-                <w:noProof/>
-              </w:rPr>
-              <w:t>Sklop 1.</w:t>
-            </w:r>
-            <w:r>
-              <w:rPr>
                 <w:noProof/>
                 <w:webHidden/>
               </w:rPr>
-              <w:tab/>
+              <w:fldChar w:fldCharType="begin"/>
             </w:r>
             <w:r>
               <w:rPr>
                 <w:noProof/>
                 <w:webHidden/>
               </w:rPr>
-              <w:fldChar w:fldCharType="begin"/>
+              <w:instrText xml:space="preserve"> PAGEREF _Toc232881741 \h </w:instrText>
             </w:r>
             <w:r>
               <w:rPr>
                 <w:noProof/>
                 <w:webHidden/>
               </w:rPr>
-              <w:instrText xml:space="preserve"> PAGEREF _Toc232428160 \h </w:instrText>
             </w:r>
             <w:r>
               <w:rPr>
@@ -3829,13 +4212,10 @@
             </w:r>
             <w:r>
               <w:rPr>
-                <w:b/>
-                <w:bCs/>
                 <w:noProof/>
                 <w:webHidden/>
-                <w:lang w:val="en-GB"/>
-              </w:rPr>
-              <w:t>Error! Bookmark not defined.</w:t>
+              </w:rPr>
+              <w:t>18</w:t>
             </w:r>
             <w:r>
               <w:rPr>
@@ -3850,39 +4230,97 @@
           <w:pPr>
             <w:pStyle w:val="TOC2"/>
             <w:tabs>
-              <w:tab w:val="left" w:pos="880"/>
               <w:tab w:val="right" w:leader="dot" w:pos="8493"/>
             </w:tabs>
             <w:rPr>
               <w:rFonts w:asciiTheme="minorHAnsi" w:eastAsiaTheme="minorEastAsia" w:hAnsiTheme="minorHAnsi"/>
               <w:noProof/>
-              <w:sz w:val="22"/>
-              <w:lang w:eastAsia="hr-HR"/>
+              <w:kern w:val="2"/>
+              <w:szCs w:val="24"/>
+              <w:lang w:val="en-GB" w:eastAsia="en-GB"/>
+              <w14:ligatures w14:val="standardContextual"/>
             </w:rPr>
           </w:pPr>
-          <w:hyperlink w:anchor="_Toc232428161" w:history="1">
+          <w:hyperlink w:anchor="_Toc232881742" w:history="1">
             <w:r>
               <w:rPr>
                 <w:rStyle w:val="Hyperlink"/>
                 <w:noProof/>
               </w:rPr>
-              <w:t>2.2.</w:t>
-            </w:r>
-            <w:r>
-              <w:rPr>
-                <w:rFonts w:asciiTheme="minorHAnsi" w:eastAsiaTheme="minorEastAsia" w:hAnsiTheme="minorHAnsi"/>
-                <w:noProof/>
-                <w:sz w:val="22"/>
-                <w:lang w:eastAsia="hr-HR"/>
+              <w:t>5.2 Pojačalo klase B</w:t>
+            </w:r>
+            <w:r>
+              <w:rPr>
+                <w:noProof/>
+                <w:webHidden/>
               </w:rPr>
               <w:tab/>
             </w:r>
             <w:r>
               <w:rPr>
+                <w:noProof/>
+                <w:webHidden/>
+              </w:rPr>
+              <w:fldChar w:fldCharType="begin"/>
+            </w:r>
+            <w:r>
+              <w:rPr>
+                <w:noProof/>
+                <w:webHidden/>
+              </w:rPr>
+              <w:instrText xml:space="preserve"> PAGEREF _Toc232881742 \h </w:instrText>
+            </w:r>
+            <w:r>
+              <w:rPr>
+                <w:noProof/>
+                <w:webHidden/>
+              </w:rPr>
+            </w:r>
+            <w:r>
+              <w:rPr>
+                <w:noProof/>
+                <w:webHidden/>
+              </w:rPr>
+              <w:fldChar w:fldCharType="separate"/>
+            </w:r>
+            <w:r>
+              <w:rPr>
+                <w:noProof/>
+                <w:webHidden/>
+              </w:rPr>
+              <w:t>18</w:t>
+            </w:r>
+            <w:r>
+              <w:rPr>
+                <w:noProof/>
+                <w:webHidden/>
+              </w:rPr>
+              <w:fldChar w:fldCharType="end"/>
+            </w:r>
+          </w:hyperlink>
+        </w:p>
+        <w:p>
+          <w:pPr>
+            <w:pStyle w:val="TOC2"/>
+            <w:tabs>
+              <w:tab w:val="right" w:leader="dot" w:pos="8493"/>
+            </w:tabs>
+            <w:rPr>
+              <w:rFonts w:asciiTheme="minorHAnsi" w:eastAsiaTheme="minorEastAsia" w:hAnsiTheme="minorHAnsi"/>
+              <w:noProof/>
+              <w:kern w:val="2"/>
+              <w:szCs w:val="24"/>
+              <w:lang w:val="en-GB" w:eastAsia="en-GB"/>
+              <w14:ligatures w14:val="standardContextual"/>
+            </w:rPr>
+          </w:pPr>
+          <w:hyperlink w:anchor="_Toc232881743" w:history="1">
+            <w:r>
+              <w:rPr>
                 <w:rStyle w:val="Hyperlink"/>
                 <w:noProof/>
               </w:rPr>
-              <w:t>Sklop 2.</w:t>
+              <w:t>5.3 Pojačalo klase AB</w:t>
             </w:r>
             <w:r>
               <w:rPr>
@@ -3903,24 +4341,27 @@
                 <w:noProof/>
                 <w:webHidden/>
               </w:rPr>
-              <w:instrText xml:space="preserve"> PAGEREF _Toc232428161 \h </w:instrText>
+              <w:instrText xml:space="preserve"> PAGEREF _Toc232881743 \h </w:instrText>
             </w:r>
             <w:r>
               <w:rPr>
                 <w:noProof/>
                 <w:webHidden/>
               </w:rPr>
+            </w:r>
+            <w:r>
+              <w:rPr>
+                <w:noProof/>
+                <w:webHidden/>
+              </w:rPr>
               <w:fldChar w:fldCharType="separate"/>
             </w:r>
             <w:r>
               <w:rPr>
-                <w:b/>
-                <w:bCs/>
                 <w:noProof/>
                 <w:webHidden/>
-                <w:lang w:val="en-GB"/>
-              </w:rPr>
-              <w:t>Error! Bookmark not defined.</w:t>
+              </w:rPr>
+              <w:t>18</w:t>
             </w:r>
             <w:r>
               <w:rPr>
@@ -3937,54 +4378,46 @@
             <w:rPr>
               <w:rFonts w:asciiTheme="minorHAnsi" w:eastAsiaTheme="minorEastAsia" w:hAnsiTheme="minorHAnsi"/>
               <w:noProof/>
-              <w:sz w:val="22"/>
-              <w:lang w:eastAsia="hr-HR"/>
+              <w:kern w:val="2"/>
+              <w:szCs w:val="24"/>
+              <w:lang w:val="en-GB" w:eastAsia="en-GB"/>
+              <w14:ligatures w14:val="standardContextual"/>
             </w:rPr>
           </w:pPr>
-          <w:hyperlink w:anchor="_Toc232428162" w:history="1">
+          <w:hyperlink w:anchor="_Toc232881744" w:history="1">
             <w:r>
               <w:rPr>
                 <w:rStyle w:val="Hyperlink"/>
                 <w:noProof/>
               </w:rPr>
-              <w:t>3.</w:t>
-            </w:r>
-            <w:r>
-              <w:rPr>
-                <w:rFonts w:asciiTheme="minorHAnsi" w:eastAsiaTheme="minorEastAsia" w:hAnsiTheme="minorHAnsi"/>
-                <w:noProof/>
-                <w:sz w:val="22"/>
-                <w:lang w:eastAsia="hr-HR"/>
+              <w:t>6 Usporedba rezultata analize, simulacija i mjerenja</w:t>
+            </w:r>
+            <w:r>
+              <w:rPr>
+                <w:noProof/>
+                <w:webHidden/>
               </w:rPr>
               <w:tab/>
             </w:r>
             <w:r>
               <w:rPr>
-                <w:rStyle w:val="Hyperlink"/>
-                <w:noProof/>
-              </w:rPr>
-              <w:t>Programska podrška (SW)</w:t>
-            </w:r>
-            <w:r>
-              <w:rPr>
                 <w:noProof/>
                 <w:webHidden/>
               </w:rPr>
-              <w:tab/>
+              <w:fldChar w:fldCharType="begin"/>
             </w:r>
             <w:r>
               <w:rPr>
                 <w:noProof/>
                 <w:webHidden/>
               </w:rPr>
-              <w:fldChar w:fldCharType="begin"/>
+              <w:instrText xml:space="preserve"> PAGEREF _Toc232881744 \h </w:instrText>
             </w:r>
             <w:r>
               <w:rPr>
                 <w:noProof/>
                 <w:webHidden/>
               </w:rPr>
-              <w:instrText xml:space="preserve"> PAGEREF _Toc232428162 \h </w:instrText>
             </w:r>
             <w:r>
               <w:rPr>
@@ -3995,183 +4428,10 @@
             </w:r>
             <w:r>
               <w:rPr>
-                <w:b/>
-                <w:bCs/>
                 <w:noProof/>
                 <w:webHidden/>
-                <w:lang w:val="en-GB"/>
-              </w:rPr>
-              <w:t>Error! Bookmark not defined.</w:t>
-            </w:r>
-            <w:r>
-              <w:rPr>
-                <w:noProof/>
-                <w:webHidden/>
-              </w:rPr>
-              <w:fldChar w:fldCharType="end"/>
-            </w:r>
-          </w:hyperlink>
-        </w:p>
-        <w:p>
-          <w:pPr>
-            <w:pStyle w:val="TOC2"/>
-            <w:tabs>
-              <w:tab w:val="left" w:pos="880"/>
-              <w:tab w:val="right" w:leader="dot" w:pos="8493"/>
-            </w:tabs>
-            <w:rPr>
-              <w:rFonts w:asciiTheme="minorHAnsi" w:eastAsiaTheme="minorEastAsia" w:hAnsiTheme="minorHAnsi"/>
-              <w:noProof/>
-              <w:sz w:val="22"/>
-              <w:lang w:eastAsia="hr-HR"/>
-            </w:rPr>
-          </w:pPr>
-          <w:hyperlink w:anchor="_Toc232428163" w:history="1">
-            <w:r>
-              <w:rPr>
-                <w:rStyle w:val="Hyperlink"/>
-                <w:noProof/>
-              </w:rPr>
-              <w:t>3.1.</w:t>
-            </w:r>
-            <w:r>
-              <w:rPr>
-                <w:rFonts w:asciiTheme="minorHAnsi" w:eastAsiaTheme="minorEastAsia" w:hAnsiTheme="minorHAnsi"/>
-                <w:noProof/>
-                <w:sz w:val="22"/>
-                <w:lang w:eastAsia="hr-HR"/>
-              </w:rPr>
-              <w:tab/>
-            </w:r>
-            <w:r>
-              <w:rPr>
-                <w:rStyle w:val="Hyperlink"/>
-                <w:noProof/>
-              </w:rPr>
-              <w:t>Programski blok 1.</w:t>
-            </w:r>
-            <w:r>
-              <w:rPr>
-                <w:noProof/>
-                <w:webHidden/>
-              </w:rPr>
-              <w:tab/>
-            </w:r>
-            <w:r>
-              <w:rPr>
-                <w:noProof/>
-                <w:webHidden/>
-              </w:rPr>
-              <w:fldChar w:fldCharType="begin"/>
-            </w:r>
-            <w:r>
-              <w:rPr>
-                <w:noProof/>
-                <w:webHidden/>
-              </w:rPr>
-              <w:instrText xml:space="preserve"> PAGEREF _Toc232428163 \h </w:instrText>
-            </w:r>
-            <w:r>
-              <w:rPr>
-                <w:noProof/>
-                <w:webHidden/>
-              </w:rPr>
-              <w:fldChar w:fldCharType="separate"/>
-            </w:r>
-            <w:r>
-              <w:rPr>
-                <w:b/>
-                <w:bCs/>
-                <w:noProof/>
-                <w:webHidden/>
-                <w:lang w:val="en-GB"/>
-              </w:rPr>
-              <w:t>Error! Bookmark not defined.</w:t>
-            </w:r>
-            <w:r>
-              <w:rPr>
-                <w:noProof/>
-                <w:webHidden/>
-              </w:rPr>
-              <w:fldChar w:fldCharType="end"/>
-            </w:r>
-          </w:hyperlink>
-        </w:p>
-        <w:p>
-          <w:pPr>
-            <w:pStyle w:val="TOC2"/>
-            <w:tabs>
-              <w:tab w:val="left" w:pos="880"/>
-              <w:tab w:val="right" w:leader="dot" w:pos="8493"/>
-            </w:tabs>
-            <w:rPr>
-              <w:rFonts w:asciiTheme="minorHAnsi" w:eastAsiaTheme="minorEastAsia" w:hAnsiTheme="minorHAnsi"/>
-              <w:noProof/>
-              <w:sz w:val="22"/>
-              <w:lang w:eastAsia="hr-HR"/>
-            </w:rPr>
-          </w:pPr>
-          <w:hyperlink w:anchor="_Toc232428164" w:history="1">
-            <w:r>
-              <w:rPr>
-                <w:rStyle w:val="Hyperlink"/>
-                <w:noProof/>
-              </w:rPr>
-              <w:t>3.2.</w:t>
-            </w:r>
-            <w:r>
-              <w:rPr>
-                <w:rFonts w:asciiTheme="minorHAnsi" w:eastAsiaTheme="minorEastAsia" w:hAnsiTheme="minorHAnsi"/>
-                <w:noProof/>
-                <w:sz w:val="22"/>
-                <w:lang w:eastAsia="hr-HR"/>
-              </w:rPr>
-              <w:tab/>
-            </w:r>
-            <w:r>
-              <w:rPr>
-                <w:rStyle w:val="Hyperlink"/>
-                <w:noProof/>
-              </w:rPr>
-              <w:t>Programski blok 2.</w:t>
-            </w:r>
-            <w:r>
-              <w:rPr>
-                <w:noProof/>
-                <w:webHidden/>
-              </w:rPr>
-              <w:tab/>
-            </w:r>
-            <w:r>
-              <w:rPr>
-                <w:noProof/>
-                <w:webHidden/>
-              </w:rPr>
-              <w:fldChar w:fldCharType="begin"/>
-            </w:r>
-            <w:r>
-              <w:rPr>
-                <w:noProof/>
-                <w:webHidden/>
-              </w:rPr>
-              <w:instrText xml:space="preserve"> PAGEREF _Toc232428164 \h </w:instrText>
-            </w:r>
-            <w:r>
-              <w:rPr>
-                <w:noProof/>
-                <w:webHidden/>
-              </w:rPr>
-              <w:fldChar w:fldCharType="separate"/>
-            </w:r>
-            <w:r>
-              <w:rPr>
-                <w:b/>
-                <w:bCs/>
-                <w:noProof/>
-                <w:webHidden/>
-                <w:lang w:val="en-GB"/>
-              </w:rPr>
-              <w:t>Error! Bookmark not defined.</w:t>
+              </w:rPr>
+              <w:t>18</w:t>
             </w:r>
             <w:r>
               <w:rPr>
@@ -4188,54 +4448,46 @@
             <w:rPr>
               <w:rFonts w:asciiTheme="minorHAnsi" w:eastAsiaTheme="minorEastAsia" w:hAnsiTheme="minorHAnsi"/>
               <w:noProof/>
-              <w:sz w:val="22"/>
-              <w:lang w:eastAsia="hr-HR"/>
+              <w:kern w:val="2"/>
+              <w:szCs w:val="24"/>
+              <w:lang w:val="en-GB" w:eastAsia="en-GB"/>
+              <w14:ligatures w14:val="standardContextual"/>
             </w:rPr>
           </w:pPr>
-          <w:hyperlink w:anchor="_Toc232428165" w:history="1">
+          <w:hyperlink w:anchor="_Toc232881745" w:history="1">
             <w:r>
               <w:rPr>
                 <w:rStyle w:val="Hyperlink"/>
                 <w:noProof/>
               </w:rPr>
-              <w:t>4.</w:t>
-            </w:r>
-            <w:r>
-              <w:rPr>
-                <w:rFonts w:asciiTheme="minorHAnsi" w:eastAsiaTheme="minorEastAsia" w:hAnsiTheme="minorHAnsi"/>
-                <w:noProof/>
-                <w:sz w:val="22"/>
-                <w:lang w:eastAsia="hr-HR"/>
+              <w:t>7 Zaključak</w:t>
+            </w:r>
+            <w:r>
+              <w:rPr>
+                <w:noProof/>
+                <w:webHidden/>
               </w:rPr>
               <w:tab/>
             </w:r>
             <w:r>
               <w:rPr>
-                <w:rStyle w:val="Hyperlink"/>
-                <w:noProof/>
-              </w:rPr>
-              <w:t>Ispitivanje i prikaz rezultata (HW i SW)</w:t>
-            </w:r>
-            <w:r>
-              <w:rPr>
                 <w:noProof/>
                 <w:webHidden/>
               </w:rPr>
-              <w:tab/>
+              <w:fldChar w:fldCharType="begin"/>
             </w:r>
             <w:r>
               <w:rPr>
                 <w:noProof/>
                 <w:webHidden/>
               </w:rPr>
-              <w:fldChar w:fldCharType="begin"/>
+              <w:instrText xml:space="preserve"> PAGEREF _Toc232881745 \h </w:instrText>
             </w:r>
             <w:r>
               <w:rPr>
                 <w:noProof/>
                 <w:webHidden/>
               </w:rPr>
-              <w:instrText xml:space="preserve"> PAGEREF _Toc232428165 \h </w:instrText>
             </w:r>
             <w:r>
               <w:rPr>
@@ -4246,353 +4498,10 @@
             </w:r>
             <w:r>
               <w:rPr>
-                <w:b/>
-                <w:bCs/>
                 <w:noProof/>
                 <w:webHidden/>
-                <w:lang w:val="en-GB"/>
-              </w:rPr>
-              <w:t>Error! Bookmark not defined.</w:t>
-            </w:r>
-            <w:r>
-              <w:rPr>
-                <w:noProof/>
-                <w:webHidden/>
-              </w:rPr>
-              <w:fldChar w:fldCharType="end"/>
-            </w:r>
-          </w:hyperlink>
-        </w:p>
-        <w:p>
-          <w:pPr>
-            <w:pStyle w:val="TOC2"/>
-            <w:tabs>
-              <w:tab w:val="left" w:pos="880"/>
-              <w:tab w:val="right" w:leader="dot" w:pos="8493"/>
-            </w:tabs>
-            <w:rPr>
-              <w:rFonts w:asciiTheme="minorHAnsi" w:eastAsiaTheme="minorEastAsia" w:hAnsiTheme="minorHAnsi"/>
-              <w:noProof/>
-              <w:sz w:val="22"/>
-              <w:lang w:eastAsia="hr-HR"/>
-            </w:rPr>
-          </w:pPr>
-          <w:hyperlink w:anchor="_Toc232428166" w:history="1">
-            <w:r>
-              <w:rPr>
-                <w:rStyle w:val="Hyperlink"/>
-                <w:noProof/>
-              </w:rPr>
-              <w:t>4.1.</w:t>
-            </w:r>
-            <w:r>
-              <w:rPr>
-                <w:rFonts w:asciiTheme="minorHAnsi" w:eastAsiaTheme="minorEastAsia" w:hAnsiTheme="minorHAnsi"/>
-                <w:noProof/>
-                <w:sz w:val="22"/>
-                <w:lang w:eastAsia="hr-HR"/>
-              </w:rPr>
-              <w:tab/>
-            </w:r>
-            <w:r>
-              <w:rPr>
-                <w:rStyle w:val="Hyperlink"/>
-                <w:noProof/>
-              </w:rPr>
-              <w:t>Ispitivanje 1.</w:t>
-            </w:r>
-            <w:r>
-              <w:rPr>
-                <w:noProof/>
-                <w:webHidden/>
-              </w:rPr>
-              <w:tab/>
-            </w:r>
-            <w:r>
-              <w:rPr>
-                <w:noProof/>
-                <w:webHidden/>
-              </w:rPr>
-              <w:fldChar w:fldCharType="begin"/>
-            </w:r>
-            <w:r>
-              <w:rPr>
-                <w:noProof/>
-                <w:webHidden/>
-              </w:rPr>
-              <w:instrText xml:space="preserve"> PAGEREF _Toc232428166 \h </w:instrText>
-            </w:r>
-            <w:r>
-              <w:rPr>
-                <w:noProof/>
-                <w:webHidden/>
-              </w:rPr>
-              <w:fldChar w:fldCharType="separate"/>
-            </w:r>
-            <w:r>
-              <w:rPr>
-                <w:b/>
-                <w:bCs/>
-                <w:noProof/>
-                <w:webHidden/>
-                <w:lang w:val="en-GB"/>
-              </w:rPr>
-              <w:t>Error! Bookmark not defined.</w:t>
-            </w:r>
-            <w:r>
-              <w:rPr>
-                <w:noProof/>
-                <w:webHidden/>
-              </w:rPr>
-              <w:fldChar w:fldCharType="end"/>
-            </w:r>
-          </w:hyperlink>
-        </w:p>
-        <w:p>
-          <w:pPr>
-            <w:pStyle w:val="TOC2"/>
-            <w:tabs>
-              <w:tab w:val="left" w:pos="880"/>
-              <w:tab w:val="right" w:leader="dot" w:pos="8493"/>
-            </w:tabs>
-            <w:rPr>
-              <w:rFonts w:asciiTheme="minorHAnsi" w:eastAsiaTheme="minorEastAsia" w:hAnsiTheme="minorHAnsi"/>
-              <w:noProof/>
-              <w:sz w:val="22"/>
-              <w:lang w:eastAsia="hr-HR"/>
-            </w:rPr>
-          </w:pPr>
-          <w:hyperlink w:anchor="_Toc232428167" w:history="1">
-            <w:r>
-              <w:rPr>
-                <w:rStyle w:val="Hyperlink"/>
-                <w:noProof/>
-              </w:rPr>
-              <w:t>4.2.</w:t>
-            </w:r>
-            <w:r>
-              <w:rPr>
-                <w:rFonts w:asciiTheme="minorHAnsi" w:eastAsiaTheme="minorEastAsia" w:hAnsiTheme="minorHAnsi"/>
-                <w:noProof/>
-                <w:sz w:val="22"/>
-                <w:lang w:eastAsia="hr-HR"/>
-              </w:rPr>
-              <w:tab/>
-            </w:r>
-            <w:r>
-              <w:rPr>
-                <w:rStyle w:val="Hyperlink"/>
-                <w:noProof/>
-              </w:rPr>
-              <w:t>Rezultat 1.</w:t>
-            </w:r>
-            <w:r>
-              <w:rPr>
-                <w:noProof/>
-                <w:webHidden/>
-              </w:rPr>
-              <w:tab/>
-            </w:r>
-            <w:r>
-              <w:rPr>
-                <w:noProof/>
-                <w:webHidden/>
-              </w:rPr>
-              <w:fldChar w:fldCharType="begin"/>
-            </w:r>
-            <w:r>
-              <w:rPr>
-                <w:noProof/>
-                <w:webHidden/>
-              </w:rPr>
-              <w:instrText xml:space="preserve"> PAGEREF _Toc232428167 \h </w:instrText>
-            </w:r>
-            <w:r>
-              <w:rPr>
-                <w:noProof/>
-                <w:webHidden/>
-              </w:rPr>
-              <w:fldChar w:fldCharType="separate"/>
-            </w:r>
-            <w:r>
-              <w:rPr>
-                <w:b/>
-                <w:bCs/>
-                <w:noProof/>
-                <w:webHidden/>
-                <w:lang w:val="en-GB"/>
-              </w:rPr>
-              <w:t>Error! Bookmark not defined.</w:t>
-            </w:r>
-            <w:r>
-              <w:rPr>
-                <w:noProof/>
-                <w:webHidden/>
-              </w:rPr>
-              <w:fldChar w:fldCharType="end"/>
-            </w:r>
-          </w:hyperlink>
-        </w:p>
-        <w:p>
-          <w:pPr>
-            <w:pStyle w:val="TOC2"/>
-            <w:tabs>
-              <w:tab w:val="left" w:pos="880"/>
-              <w:tab w:val="right" w:leader="dot" w:pos="8493"/>
-            </w:tabs>
-            <w:rPr>
-              <w:rFonts w:asciiTheme="minorHAnsi" w:eastAsiaTheme="minorEastAsia" w:hAnsiTheme="minorHAnsi"/>
-              <w:noProof/>
-              <w:sz w:val="22"/>
-              <w:lang w:eastAsia="hr-HR"/>
-            </w:rPr>
-          </w:pPr>
-          <w:hyperlink w:anchor="_Toc232428168" w:history="1">
-            <w:r>
-              <w:rPr>
-                <w:rStyle w:val="Hyperlink"/>
-                <w:noProof/>
-              </w:rPr>
-              <w:t>4.3.</w:t>
-            </w:r>
-            <w:r>
-              <w:rPr>
-                <w:rFonts w:asciiTheme="minorHAnsi" w:eastAsiaTheme="minorEastAsia" w:hAnsiTheme="minorHAnsi"/>
-                <w:noProof/>
-                <w:sz w:val="22"/>
-                <w:lang w:eastAsia="hr-HR"/>
-              </w:rPr>
-              <w:tab/>
-            </w:r>
-            <w:r>
-              <w:rPr>
-                <w:rStyle w:val="Hyperlink"/>
-                <w:noProof/>
-              </w:rPr>
-              <w:t>Ispitivanje 2.</w:t>
-            </w:r>
-            <w:r>
-              <w:rPr>
-                <w:noProof/>
-                <w:webHidden/>
-              </w:rPr>
-              <w:tab/>
-            </w:r>
-            <w:r>
-              <w:rPr>
-                <w:noProof/>
-                <w:webHidden/>
-              </w:rPr>
-              <w:fldChar w:fldCharType="begin"/>
-            </w:r>
-            <w:r>
-              <w:rPr>
-                <w:noProof/>
-                <w:webHidden/>
-              </w:rPr>
-              <w:instrText xml:space="preserve"> PAGEREF _Toc232428168 \h </w:instrText>
-            </w:r>
-            <w:r>
-              <w:rPr>
-                <w:noProof/>
-                <w:webHidden/>
-              </w:rPr>
-              <w:fldChar w:fldCharType="separate"/>
-            </w:r>
-            <w:r>
-              <w:rPr>
-                <w:b/>
-                <w:bCs/>
-                <w:noProof/>
-                <w:webHidden/>
-                <w:lang w:val="en-GB"/>
-              </w:rPr>
-              <w:t>Error! Bookmark not defined.</w:t>
-            </w:r>
-            <w:r>
-              <w:rPr>
-                <w:noProof/>
-                <w:webHidden/>
-              </w:rPr>
-              <w:fldChar w:fldCharType="end"/>
-            </w:r>
-          </w:hyperlink>
-        </w:p>
-        <w:p>
-          <w:pPr>
-            <w:pStyle w:val="TOC2"/>
-            <w:tabs>
-              <w:tab w:val="left" w:pos="880"/>
-              <w:tab w:val="right" w:leader="dot" w:pos="8493"/>
-            </w:tabs>
-            <w:rPr>
-              <w:rFonts w:asciiTheme="minorHAnsi" w:eastAsiaTheme="minorEastAsia" w:hAnsiTheme="minorHAnsi"/>
-              <w:noProof/>
-              <w:sz w:val="22"/>
-              <w:lang w:eastAsia="hr-HR"/>
-            </w:rPr>
-          </w:pPr>
-          <w:hyperlink w:anchor="_Toc232428169" w:history="1">
-            <w:r>
-              <w:rPr>
-                <w:rStyle w:val="Hyperlink"/>
-                <w:noProof/>
-              </w:rPr>
-              <w:t>4.4.</w:t>
-            </w:r>
-            <w:r>
-              <w:rPr>
-                <w:rFonts w:asciiTheme="minorHAnsi" w:eastAsiaTheme="minorEastAsia" w:hAnsiTheme="minorHAnsi"/>
-                <w:noProof/>
-                <w:sz w:val="22"/>
-                <w:lang w:eastAsia="hr-HR"/>
-              </w:rPr>
-              <w:tab/>
-            </w:r>
-            <w:r>
-              <w:rPr>
-                <w:rStyle w:val="Hyperlink"/>
-                <w:noProof/>
-              </w:rPr>
-              <w:t>Rezultat 2.</w:t>
-            </w:r>
-            <w:r>
-              <w:rPr>
-                <w:noProof/>
-                <w:webHidden/>
-              </w:rPr>
-              <w:tab/>
-            </w:r>
-            <w:r>
-              <w:rPr>
-                <w:noProof/>
-                <w:webHidden/>
-              </w:rPr>
-              <w:fldChar w:fldCharType="begin"/>
-            </w:r>
-            <w:r>
-              <w:rPr>
-                <w:noProof/>
-                <w:webHidden/>
-              </w:rPr>
-              <w:instrText xml:space="preserve"> PAGEREF _Toc232428169 \h </w:instrText>
-            </w:r>
-            <w:r>
-              <w:rPr>
-                <w:noProof/>
-                <w:webHidden/>
-              </w:rPr>
-              <w:fldChar w:fldCharType="separate"/>
-            </w:r>
-            <w:r>
-              <w:rPr>
-                <w:b/>
-                <w:bCs/>
-                <w:noProof/>
-                <w:webHidden/>
-                <w:lang w:val="en-GB"/>
-              </w:rPr>
-              <w:t>Error! Bookmark not defined.</w:t>
+              </w:rPr>
+              <w:t>18</w:t>
             </w:r>
             <w:r>
               <w:rPr>
@@ -4609,54 +4518,40 @@
             <w:rPr>
               <w:rFonts w:asciiTheme="minorHAnsi" w:eastAsiaTheme="minorEastAsia" w:hAnsiTheme="minorHAnsi"/>
               <w:noProof/>
-              <w:sz w:val="22"/>
-              <w:lang w:eastAsia="hr-HR"/>
+              <w:kern w:val="2"/>
+              <w:szCs w:val="24"/>
+              <w:lang w:val="en-GB" w:eastAsia="en-GB"/>
+              <w14:ligatures w14:val="standardContextual"/>
             </w:rPr>
           </w:pPr>
-          <w:hyperlink w:anchor="_Toc232428170" w:history="1">
+          <w:hyperlink w:anchor="_Toc232881746" w:history="1">
             <w:r>
               <w:rPr>
                 <w:rStyle w:val="Hyperlink"/>
                 <w:noProof/>
               </w:rPr>
-              <w:t>5.</w:t>
-            </w:r>
-            <w:r>
-              <w:rPr>
-                <w:rFonts w:asciiTheme="minorHAnsi" w:eastAsiaTheme="minorEastAsia" w:hAnsiTheme="minorHAnsi"/>
-                <w:noProof/>
-                <w:sz w:val="22"/>
-                <w:lang w:eastAsia="hr-HR"/>
+              <w:t>8 Literatura</w:t>
+            </w:r>
+            <w:r>
+              <w:rPr>
+                <w:noProof/>
+                <w:webHidden/>
               </w:rPr>
               <w:tab/>
             </w:r>
             <w:r>
               <w:rPr>
-                <w:rStyle w:val="Hyperlink"/>
-                <w:noProof/>
-              </w:rPr>
-              <w:t>Zaključak</w:t>
-            </w:r>
-            <w:r>
-              <w:rPr>
                 <w:noProof/>
                 <w:webHidden/>
               </w:rPr>
-              <w:tab/>
+              <w:fldChar w:fldCharType="begin"/>
             </w:r>
             <w:r>
               <w:rPr>
                 <w:noProof/>
                 <w:webHidden/>
               </w:rPr>
-              <w:fldChar w:fldCharType="begin"/>
-            </w:r>
-            <w:r>
-              <w:rPr>
-                <w:noProof/>
-                <w:webHidden/>
-              </w:rPr>
-              <w:instrText xml:space="preserve"> PAGEREF _Toc232428170 \h </w:instrText>
+              <w:instrText xml:space="preserve"> PAGEREF _Toc232881746 \h </w:instrText>
             </w:r>
             <w:r>
               <w:rPr>
@@ -4693,17 +4588,19 @@
             <w:rPr>
               <w:rFonts w:asciiTheme="minorHAnsi" w:eastAsiaTheme="minorEastAsia" w:hAnsiTheme="minorHAnsi"/>
               <w:noProof/>
-              <w:sz w:val="22"/>
-              <w:lang w:eastAsia="hr-HR"/>
+              <w:kern w:val="2"/>
+              <w:szCs w:val="24"/>
+              <w:lang w:val="en-GB" w:eastAsia="en-GB"/>
+              <w14:ligatures w14:val="standardContextual"/>
             </w:rPr>
           </w:pPr>
-          <w:hyperlink w:anchor="_Toc232428171" w:history="1">
+          <w:hyperlink w:anchor="_Toc232881747" w:history="1">
             <w:r>
               <w:rPr>
                 <w:rStyle w:val="Hyperlink"/>
                 <w:noProof/>
               </w:rPr>
-              <w:t>Literatura</w:t>
+              <w:t>9 Životopis</w:t>
             </w:r>
             <w:r>
               <w:rPr>
@@ -4724,7 +4621,7 @@
                 <w:noProof/>
                 <w:webHidden/>
               </w:rPr>
-              <w:instrText xml:space="preserve"> PAGEREF _Toc232428171 \h </w:instrText>
+              <w:instrText xml:space="preserve"> PAGEREF _Toc232881747 \h </w:instrText>
             </w:r>
             <w:r>
               <w:rPr>
@@ -4744,7 +4641,7 @@
                 <w:noProof/>
                 <w:webHidden/>
               </w:rPr>
-              <w:t>18</w:t>
+              <w:t>21</w:t>
             </w:r>
             <w:r>
               <w:rPr>
@@ -4761,17 +4658,19 @@
             <w:rPr>
               <w:rFonts w:asciiTheme="minorHAnsi" w:eastAsiaTheme="minorEastAsia" w:hAnsiTheme="minorHAnsi"/>
               <w:noProof/>
-              <w:sz w:val="22"/>
-              <w:lang w:eastAsia="hr-HR"/>
+              <w:kern w:val="2"/>
+              <w:szCs w:val="24"/>
+              <w:lang w:val="en-GB" w:eastAsia="en-GB"/>
+              <w14:ligatures w14:val="standardContextual"/>
             </w:rPr>
           </w:pPr>
-          <w:hyperlink w:anchor="_Toc232428172" w:history="1">
+          <w:hyperlink w:anchor="_Toc232881748" w:history="1">
             <w:r>
               <w:rPr>
                 <w:rStyle w:val="Hyperlink"/>
                 <w:noProof/>
               </w:rPr>
-              <w:t>Životopis</w:t>
+              <w:t>10 PRILOG I – Naslov priloga</w:t>
             </w:r>
             <w:r>
               <w:rPr>
@@ -4792,75 +4691,7 @@
                 <w:noProof/>
                 <w:webHidden/>
               </w:rPr>
-              <w:instrText xml:space="preserve"> PAGEREF _Toc232428172 \h </w:instrText>
-            </w:r>
-            <w:r>
-              <w:rPr>
-                <w:noProof/>
-                <w:webHidden/>
-              </w:rPr>
-            </w:r>
-            <w:r>
-              <w:rPr>
-                <w:noProof/>
-                <w:webHidden/>
-              </w:rPr>
-              <w:fldChar w:fldCharType="separate"/>
-            </w:r>
-            <w:r>
-              <w:rPr>
-                <w:noProof/>
-                <w:webHidden/>
-              </w:rPr>
-              <w:t>21</w:t>
-            </w:r>
-            <w:r>
-              <w:rPr>
-                <w:noProof/>
-                <w:webHidden/>
-              </w:rPr>
-              <w:fldChar w:fldCharType="end"/>
-            </w:r>
-          </w:hyperlink>
-        </w:p>
-        <w:p>
-          <w:pPr>
-            <w:pStyle w:val="TOC1"/>
-            <w:rPr>
-              <w:rFonts w:asciiTheme="minorHAnsi" w:eastAsiaTheme="minorEastAsia" w:hAnsiTheme="minorHAnsi"/>
-              <w:noProof/>
-              <w:sz w:val="22"/>
-              <w:lang w:eastAsia="hr-HR"/>
-            </w:rPr>
-          </w:pPr>
-          <w:hyperlink w:anchor="_Toc232428173" w:history="1">
-            <w:r>
-              <w:rPr>
-                <w:rStyle w:val="Hyperlink"/>
-                <w:noProof/>
-              </w:rPr>
-              <w:t>PRILOG I – Naslov priloga</w:t>
-            </w:r>
-            <w:r>
-              <w:rPr>
-                <w:noProof/>
-                <w:webHidden/>
-              </w:rPr>
-              <w:tab/>
-            </w:r>
-            <w:r>
-              <w:rPr>
-                <w:noProof/>
-                <w:webHidden/>
-              </w:rPr>
-              <w:fldChar w:fldCharType="begin"/>
-            </w:r>
-            <w:r>
-              <w:rPr>
-                <w:noProof/>
-                <w:webHidden/>
-              </w:rPr>
-              <w:instrText xml:space="preserve"> PAGEREF _Toc232428173 \h </w:instrText>
+              <w:instrText xml:space="preserve"> PAGEREF _Toc232881748 \h </w:instrText>
             </w:r>
             <w:r>
               <w:rPr>
@@ -6853,160 +6684,23 @@
     </w:p>
     <w:p>
       <w:pPr>
-        <w:pStyle w:val="TableofFigures"/>
-        <w:tabs>
-          <w:tab w:val="right" w:leader="dot" w:pos="8493"/>
-        </w:tabs>
+        <w:spacing w:before="0" w:after="0"/>
+        <w:jc w:val="left"/>
         <w:rPr>
-          <w:rFonts w:asciiTheme="minorHAnsi" w:eastAsiaTheme="minorEastAsia" w:hAnsiTheme="minorHAnsi"/>
-          <w:noProof/>
-          <w:sz w:val="22"/>
-          <w:lang w:eastAsia="hr-HR"/>
+          <w:szCs w:val="24"/>
         </w:rPr>
       </w:pPr>
-      <w:r>
-        <w:fldChar w:fldCharType="begin"/>
-      </w:r>
-      <w:r>
-        <w:instrText xml:space="preserve"> TOC \h \z \c "Programski blok" </w:instrText>
-      </w:r>
-      <w:r>
-        <w:fldChar w:fldCharType="separate"/>
-      </w:r>
-      <w:hyperlink w:anchor="_Toc182917977" w:history="1">
-        <w:r>
-          <w:rPr>
-            <w:rStyle w:val="Hyperlink"/>
-            <w:noProof/>
-          </w:rPr>
-          <w:t>Tablica 1. Zbroj uzoraka signala</w:t>
-        </w:r>
-        <w:r>
-          <w:rPr>
-            <w:noProof/>
-            <w:webHidden/>
-          </w:rPr>
-          <w:tab/>
-        </w:r>
-        <w:r>
-          <w:rPr>
-            <w:noProof/>
-            <w:webHidden/>
-          </w:rPr>
-          <w:fldChar w:fldCharType="begin"/>
-        </w:r>
-        <w:r>
-          <w:rPr>
-            <w:noProof/>
-            <w:webHidden/>
-          </w:rPr>
-          <w:instrText xml:space="preserve"> PAGEREF _Toc182917977 \h </w:instrText>
-        </w:r>
-        <w:r>
-          <w:rPr>
-            <w:noProof/>
-            <w:webHidden/>
-          </w:rPr>
-          <w:fldChar w:fldCharType="separate"/>
-        </w:r>
+      <w:fldSimple w:instr=" TOC \h \z \c &quot;Programski blok&quot; ">
         <w:r>
           <w:rPr>
             <w:b/>
             <w:bCs/>
             <w:noProof/>
-            <w:webHidden/>
             <w:lang w:val="en-GB"/>
           </w:rPr>
-          <w:t>Error! Bookmark not defined.</w:t>
+          <w:t>No table of figures entries found.</w:t>
         </w:r>
-        <w:r>
-          <w:rPr>
-            <w:noProof/>
-            <w:webHidden/>
-          </w:rPr>
-          <w:fldChar w:fldCharType="end"/>
-        </w:r>
-      </w:hyperlink>
-    </w:p>
-    <w:p>
-      <w:pPr>
-        <w:pStyle w:val="TableofFigures"/>
-        <w:tabs>
-          <w:tab w:val="right" w:leader="dot" w:pos="8493"/>
-        </w:tabs>
-        <w:rPr>
-          <w:rFonts w:asciiTheme="minorHAnsi" w:eastAsiaTheme="minorEastAsia" w:hAnsiTheme="minorHAnsi"/>
-          <w:noProof/>
-          <w:sz w:val="22"/>
-          <w:lang w:eastAsia="hr-HR"/>
-        </w:rPr>
-      </w:pPr>
-      <w:hyperlink w:anchor="_Toc182917978" w:history="1">
-        <w:r>
-          <w:rPr>
-            <w:rStyle w:val="Hyperlink"/>
-            <w:noProof/>
-          </w:rPr>
-          <w:t>Tablica 2. Programski odsječak za izračun zbroja [4]</w:t>
-        </w:r>
-        <w:r>
-          <w:rPr>
-            <w:noProof/>
-            <w:webHidden/>
-          </w:rPr>
-          <w:tab/>
-        </w:r>
-        <w:r>
-          <w:rPr>
-            <w:noProof/>
-            <w:webHidden/>
-          </w:rPr>
-          <w:fldChar w:fldCharType="begin"/>
-        </w:r>
-        <w:r>
-          <w:rPr>
-            <w:noProof/>
-            <w:webHidden/>
-          </w:rPr>
-          <w:instrText xml:space="preserve"> PAGEREF _Toc182917978 \h </w:instrText>
-        </w:r>
-        <w:r>
-          <w:rPr>
-            <w:noProof/>
-            <w:webHidden/>
-          </w:rPr>
-          <w:fldChar w:fldCharType="separate"/>
-        </w:r>
-        <w:r>
-          <w:rPr>
-            <w:b/>
-            <w:bCs/>
-            <w:noProof/>
-            <w:webHidden/>
-            <w:lang w:val="en-GB"/>
-          </w:rPr>
-          <w:t>Error! Bookmark not defined.</w:t>
-        </w:r>
-        <w:r>
-          <w:rPr>
-            <w:noProof/>
-            <w:webHidden/>
-          </w:rPr>
-          <w:fldChar w:fldCharType="end"/>
-        </w:r>
-      </w:hyperlink>
-    </w:p>
-    <w:p>
-      <w:pPr>
-        <w:spacing w:before="0" w:after="0"/>
-        <w:jc w:val="left"/>
-        <w:rPr>
-          <w:szCs w:val="24"/>
-        </w:rPr>
-      </w:pPr>
-      <w:r>
-        <w:fldChar w:fldCharType="end"/>
-      </w:r>
+      </w:fldSimple>
     </w:p>
     <w:p>
       <w:pPr>
@@ -7155,7 +6849,7 @@
           <w:numId w:val="0"/>
         </w:numPr>
       </w:pPr>
-      <w:bookmarkStart w:id="0" w:name="_Toc232428122"/>
+      <w:bookmarkStart w:id="0" w:name="_Toc232881699"/>
       <w:r>
         <w:lastRenderedPageBreak/>
         <w:t xml:space="preserve">1. </w:t>
@@ -7172,12 +6866,12 @@
       <w:pPr>
         <w:pStyle w:val="Heading2"/>
       </w:pPr>
-      <w:bookmarkStart w:id="1" w:name="_Toc232428123"/>
-      <w:bookmarkStart w:id="2" w:name="_Hlk182805520"/>
+      <w:bookmarkStart w:id="1" w:name="_Hlk182805520"/>
+      <w:bookmarkStart w:id="2" w:name="_Toc232881700"/>
       <w:r>
         <w:t>Opis rada</w:t>
       </w:r>
-      <w:bookmarkEnd w:id="1"/>
+      <w:bookmarkEnd w:id="2"/>
     </w:p>
     <w:p>
       <w:pPr>
@@ -7205,7 +6899,7 @@
       <w:pPr>
         <w:pStyle w:val="Heading2"/>
       </w:pPr>
-      <w:bookmarkStart w:id="3" w:name="_Toc232428124"/>
+      <w:bookmarkStart w:id="3" w:name="_Toc232881701"/>
       <w:r>
         <w:t>Svrha rada</w:t>
       </w:r>
@@ -7234,7 +6928,7 @@
       <w:pPr>
         <w:pStyle w:val="Heading2"/>
       </w:pPr>
-      <w:bookmarkStart w:id="4" w:name="_Toc232428125"/>
+      <w:bookmarkStart w:id="4" w:name="_Toc232881702"/>
       <w:r>
         <w:t>Način izvedbe rada</w:t>
       </w:r>
@@ -7381,7 +7075,7 @@
       <w:r>
         <w:t xml:space="preserve"> Provjera dobivenih rezultata dobivenih matematičkom analizom i simulacijom pomoću osciloskopa i generatora funkcija. </w:t>
       </w:r>
-      <w:bookmarkEnd w:id="2"/>
+      <w:bookmarkEnd w:id="1"/>
     </w:p>
     <w:p>
       <w:pPr>
@@ -7399,7 +7093,7 @@
       <w:pPr>
         <w:pStyle w:val="Heading1"/>
       </w:pPr>
-      <w:bookmarkStart w:id="5" w:name="_Toc232428126"/>
+      <w:bookmarkStart w:id="5" w:name="_Toc232881703"/>
       <w:r>
         <w:lastRenderedPageBreak/>
         <w:t>Osnovi pojmovi</w:t>
@@ -7426,7 +7120,7 @@
       <w:pPr>
         <w:pStyle w:val="Heading2"/>
       </w:pPr>
-      <w:bookmarkStart w:id="6" w:name="_Toc232428127"/>
+      <w:bookmarkStart w:id="6" w:name="_Toc232881704"/>
       <w:r>
         <w:t>Harmonijska analiza</w:t>
       </w:r>
@@ -7436,7 +7130,7 @@
       <w:pPr>
         <w:pStyle w:val="Heading3"/>
       </w:pPr>
-      <w:bookmarkStart w:id="7" w:name="_Toc232428128"/>
+      <w:bookmarkStart w:id="7" w:name="_Toc232881705"/>
       <w:r>
         <w:t xml:space="preserve">Osnovni </w:t>
       </w:r>
@@ -7554,7 +7248,7 @@
       <w:pPr>
         <w:pStyle w:val="Heading3"/>
       </w:pPr>
-      <w:bookmarkStart w:id="8" w:name="_Toc232428129"/>
+      <w:bookmarkStart w:id="8" w:name="_Toc232881706"/>
       <w:r>
         <w:t>Viši harmonici</w:t>
       </w:r>
@@ -7675,7 +7369,7 @@
       <w:pPr>
         <w:pStyle w:val="Heading3"/>
       </w:pPr>
-      <w:bookmarkStart w:id="9" w:name="_Toc232428130"/>
+      <w:bookmarkStart w:id="9" w:name="_Toc232881707"/>
       <w:r>
         <w:rPr>
           <w:i/>
@@ -8218,7 +7912,7 @@
       <w:pPr>
         <w:pStyle w:val="Heading3"/>
       </w:pPr>
-      <w:bookmarkStart w:id="10" w:name="_Toc232428131"/>
+      <w:bookmarkStart w:id="10" w:name="_Toc232881708"/>
       <w:proofErr w:type="spellStart"/>
       <w:r>
         <w:lastRenderedPageBreak/>
@@ -8228,10 +7922,10 @@
       <w:r>
         <w:t xml:space="preserve"> rastav</w:t>
       </w:r>
+      <w:r>
+        <w:t xml:space="preserve"> signala</w:t>
+      </w:r>
       <w:bookmarkEnd w:id="10"/>
-      <w:r>
-        <w:t xml:space="preserve"> signala</w:t>
-      </w:r>
     </w:p>
     <w:p>
       <w:pPr>
@@ -8240,7 +7934,6 @@
           <w:rFonts w:eastAsiaTheme="minorEastAsia"/>
         </w:rPr>
       </w:pPr>
-      <w:bookmarkStart w:id="11" w:name="_Toc232428132"/>
       <w:r>
         <w:t xml:space="preserve">Svaki periodički signal koji zadovoljava uvjete konvergencije može se zapisati kao </w:t>
       </w:r>
@@ -9472,6 +9165,7 @@
       <w:pPr>
         <w:pStyle w:val="Heading3"/>
       </w:pPr>
+      <w:bookmarkStart w:id="11" w:name="_Toc232881709"/>
       <w:proofErr w:type="spellStart"/>
       <w:r>
         <w:lastRenderedPageBreak/>
@@ -10715,7 +10409,7 @@
       <w:pPr>
         <w:pStyle w:val="Heading3"/>
       </w:pPr>
-      <w:bookmarkStart w:id="12" w:name="_Toc232428133"/>
+      <w:bookmarkStart w:id="12" w:name="_Toc232881710"/>
       <w:proofErr w:type="spellStart"/>
       <w:r>
         <w:t>Fourierov</w:t>
@@ -10745,7 +10439,7 @@
       <w:pPr>
         <w:pStyle w:val="Heading3"/>
       </w:pPr>
-      <w:bookmarkStart w:id="13" w:name="_Toc232428134"/>
+      <w:bookmarkStart w:id="13" w:name="_Toc232881711"/>
       <w:proofErr w:type="spellStart"/>
       <w:r>
         <w:t>Fourierov</w:t>
@@ -10842,7 +10536,7 @@
       <w:pPr>
         <w:pStyle w:val="Heading3"/>
       </w:pPr>
-      <w:bookmarkStart w:id="14" w:name="_Toc232428135"/>
+      <w:bookmarkStart w:id="14" w:name="_Toc232881712"/>
       <w:proofErr w:type="spellStart"/>
       <w:r>
         <w:t>Fourierov</w:t>
@@ -10885,7 +10579,7 @@
       <w:pPr>
         <w:pStyle w:val="Heading2"/>
       </w:pPr>
-      <w:bookmarkStart w:id="15" w:name="_Toc232428136"/>
+      <w:bookmarkStart w:id="15" w:name="_Toc232881713"/>
       <w:r>
         <w:t>Stupanj djelovanja</w:t>
       </w:r>
@@ -11032,7 +10726,7 @@
       <w:pPr>
         <w:pStyle w:val="Heading3"/>
       </w:pPr>
-      <w:bookmarkStart w:id="16" w:name="_Toc232428137"/>
+      <w:bookmarkStart w:id="16" w:name="_Toc232881714"/>
       <w:r>
         <w:t>Važnost stupnja djelovanja</w:t>
       </w:r>
@@ -11057,7 +10751,7 @@
       <w:pPr>
         <w:pStyle w:val="Heading2"/>
       </w:pPr>
-      <w:bookmarkStart w:id="17" w:name="_Toc232428138"/>
+      <w:bookmarkStart w:id="17" w:name="_Toc232881715"/>
       <w:r>
         <w:t>Harmonijska izobličenja</w:t>
       </w:r>
@@ -11081,45 +10775,9 @@
       <w:pPr>
         <w:pStyle w:val="Heading3"/>
       </w:pPr>
+      <w:bookmarkStart w:id="18" w:name="_Toc232881716"/>
       <w:r>
         <w:t>Uzrok nastajanja</w:t>
-      </w:r>
-    </w:p>
-    <w:p>
-      <w:pPr>
-        <w:ind w:firstLine="708"/>
-      </w:pPr>
-      <w:r>
-        <w:t xml:space="preserve">Jedan od većih uzroka </w:t>
-      </w:r>
-      <w:r>
-        <w:t>harmonijskog izobličenja je nelinearna prijenosna karakteristika poluvodičkih elemenata.</w:t>
-      </w:r>
-      <w:r>
-        <w:t xml:space="preserve"> Izobličenja mogu nastati i zbog </w:t>
-      </w:r>
-      <w:r>
-        <w:t xml:space="preserve">prevelike amplitude ulaznog signala, pri čemu dolazi do zasićenja ili rezanja izlaznog signala. Kod </w:t>
-      </w:r>
-      <w:proofErr w:type="spellStart"/>
-      <w:r>
-        <w:t>protutaktnih</w:t>
-      </w:r>
-      <w:proofErr w:type="spellEnd"/>
-      <w:r>
-        <w:t xml:space="preserve"> pojačala </w:t>
-      </w:r>
-      <w:r>
-        <w:t>dodatni uzrok može biti i „mrtva zona“ vođenja uzrokovana naponom praga vođenja tranzistora.</w:t>
-      </w:r>
-    </w:p>
-    <w:p>
-      <w:pPr>
-        <w:pStyle w:val="Heading3"/>
-      </w:pPr>
-      <w:bookmarkStart w:id="18" w:name="_Toc232428140"/>
-      <w:r>
-        <w:t>Vrste harmonijskih izobličenja</w:t>
       </w:r>
       <w:bookmarkEnd w:id="18"/>
     </w:p>
@@ -11128,76 +10786,85 @@
         <w:ind w:firstLine="708"/>
       </w:pPr>
       <w:r>
-        <w:t xml:space="preserve">U </w:t>
+        <w:t xml:space="preserve">Jedan od većih uzroka </w:t>
+      </w:r>
+      <w:r>
+        <w:t>harmonijskog izobličenja je nelinearna prijenosna karakteristika poluvodičkih elemenata.</w:t>
+      </w:r>
+      <w:r>
+        <w:t xml:space="preserve"> Izobličenja mogu nastati i zbog </w:t>
+      </w:r>
+      <w:r>
+        <w:t xml:space="preserve">prevelike amplitude ulaznog signala, pri čemu dolazi do zasićenja ili rezanja izlaznog signala. Kod </w:t>
       </w:r>
       <w:proofErr w:type="spellStart"/>
       <w:r>
-        <w:t>jednostupanjskim</w:t>
+        <w:t>protutaktnih</w:t>
       </w:r>
       <w:proofErr w:type="spellEnd"/>
       <w:r>
-        <w:t xml:space="preserve"> pojačalima </w:t>
-      </w:r>
-      <w:proofErr w:type="spellStart"/>
-      <w:r>
-        <w:t>nejčešće</w:t>
-      </w:r>
-      <w:proofErr w:type="spellEnd"/>
-      <w:r>
-        <w:t xml:space="preserve"> se promatraju izobličenja zbog nelinearnosti prijenosne karakteristike, amplitudno rezanje i </w:t>
-      </w:r>
-      <w:proofErr w:type="spellStart"/>
-      <w:r>
-        <w:t>preskočno</w:t>
-      </w:r>
-      <w:proofErr w:type="spellEnd"/>
-      <w:r>
-        <w:t xml:space="preserve"> izobličenje. Amplitudno rezanje nastaje kada izlazni signal dosegne graničnu vrijednost </w:t>
-      </w:r>
-      <w:r>
-        <w:t>određenu naponom napajanja.</w:t>
+        <w:t xml:space="preserve"> pojačala </w:t>
+      </w:r>
+      <w:r>
+        <w:t>dodatni uzrok može biti i „mrtva zona“ vođenja uzrokovana naponom praga vođenja tranzistora.</w:t>
       </w:r>
     </w:p>
     <w:p>
       <w:pPr>
         <w:pStyle w:val="Heading3"/>
       </w:pPr>
-      <w:bookmarkStart w:id="19" w:name="_Toc232428141"/>
+      <w:bookmarkStart w:id="19" w:name="_Toc232881717"/>
+      <w:r>
+        <w:t>Vrste harmonijskih izobličenja</w:t>
+      </w:r>
+      <w:bookmarkEnd w:id="19"/>
+    </w:p>
+    <w:p>
+      <w:pPr>
+        <w:ind w:firstLine="708"/>
+      </w:pPr>
+      <w:r>
+        <w:t xml:space="preserve">U </w:t>
+      </w:r>
+      <w:proofErr w:type="spellStart"/>
+      <w:r>
+        <w:t>jednostupanjskim</w:t>
+      </w:r>
+      <w:proofErr w:type="spellEnd"/>
+      <w:r>
+        <w:t xml:space="preserve"> pojačalima </w:t>
+      </w:r>
+      <w:proofErr w:type="spellStart"/>
+      <w:r>
+        <w:t>nejčešće</w:t>
+      </w:r>
+      <w:proofErr w:type="spellEnd"/>
+      <w:r>
+        <w:t xml:space="preserve"> se promatraju izobličenja zbog nelinearnosti prijenosne karakteristike, amplitudno rezanje i </w:t>
+      </w:r>
+      <w:proofErr w:type="spellStart"/>
+      <w:r>
+        <w:t>preskočno</w:t>
+      </w:r>
+      <w:proofErr w:type="spellEnd"/>
+      <w:r>
+        <w:t xml:space="preserve"> izobličenje. Amplitudno rezanje nastaje kada izlazni signal dosegne graničnu vrijednost </w:t>
+      </w:r>
+      <w:r>
+        <w:t>određenu naponom napajanja.</w:t>
+      </w:r>
+    </w:p>
+    <w:p>
+      <w:pPr>
+        <w:pStyle w:val="Heading3"/>
+      </w:pPr>
+      <w:bookmarkStart w:id="20" w:name="_Toc232881718"/>
       <w:r>
         <w:lastRenderedPageBreak/>
         <w:t xml:space="preserve">Mane </w:t>
       </w:r>
-      <w:bookmarkEnd w:id="19"/>
       <w:r>
         <w:t>harmonijskog izobličenja</w:t>
-      </w:r>
-    </w:p>
-    <w:p>
-      <w:pPr>
-        <w:ind w:firstLine="708"/>
-      </w:pPr>
-      <w:r>
-        <w:t xml:space="preserve">Velika mana harmonijskih izobličenja je loš prijenos signala jer izlazni signal više nema isti oblik kao ulazni signal. U </w:t>
-      </w:r>
-      <w:proofErr w:type="spellStart"/>
-      <w:r>
-        <w:t>audiopojačalima</w:t>
-      </w:r>
-      <w:proofErr w:type="spellEnd"/>
-      <w:r>
-        <w:t xml:space="preserve"> to uzrokuje pogoršanje zvuka. U elektroničnim sklopovima </w:t>
-      </w:r>
-      <w:r>
-        <w:t>viši harmonici uzrokuju dodatne smetnje i povećano zagrijavanje komponenti.</w:t>
-      </w:r>
-    </w:p>
-    <w:p>
-      <w:pPr>
-        <w:pStyle w:val="Heading3"/>
-      </w:pPr>
-      <w:bookmarkStart w:id="20" w:name="_Toc232428142"/>
-      <w:r>
-        <w:t>Kompenzacija harmonijskih izobličenja</w:t>
       </w:r>
       <w:bookmarkEnd w:id="20"/>
     </w:p>
@@ -11206,46 +10873,27 @@
         <w:ind w:firstLine="708"/>
       </w:pPr>
       <w:r>
-        <w:t xml:space="preserve">Harmonijska izobličenja se mogu smanjiti pravilnim namještanjem statičke radne točke, primjenom negativne povratne veze i prikladnim </w:t>
+        <w:t xml:space="preserve">Velika mana harmonijskih izobličenja je loš prijenos signala jer izlazni signal više nema isti oblik kao ulazni signal. U </w:t>
       </w:r>
       <w:proofErr w:type="spellStart"/>
       <w:r>
-        <w:t>prednaponom</w:t>
+        <w:t>audiopojačalima</w:t>
       </w:r>
       <w:proofErr w:type="spellEnd"/>
       <w:r>
-        <w:t xml:space="preserve"> izlaznog stupnja. </w:t>
-      </w:r>
-      <w:proofErr w:type="spellStart"/>
-      <w:r>
-        <w:t>Preskočno</w:t>
-      </w:r>
-      <w:proofErr w:type="spellEnd"/>
-      <w:r>
-        <w:t xml:space="preserve"> izobličenje se korigira dovođenjem </w:t>
-      </w:r>
-      <w:proofErr w:type="spellStart"/>
-      <w:r>
-        <w:t>prednapona</w:t>
-      </w:r>
-      <w:proofErr w:type="spellEnd"/>
-      <w:r>
-        <w:t xml:space="preserve">. Rezanje izlaznog signala se smanjuje </w:t>
-      </w:r>
-      <w:r>
-        <w:t>pravilnim odabirom napona napajanja i ograničenjem amplitude ulaznog signala.</w:t>
+        <w:t xml:space="preserve"> to uzrokuje pogoršanje zvuka. U elektroničnim sklopovima </w:t>
+      </w:r>
+      <w:r>
+        <w:t>viši harmonici uzrokuju dodatne smetnje i povećano zagrijavanje komponenti.</w:t>
       </w:r>
     </w:p>
     <w:p>
       <w:pPr>
         <w:pStyle w:val="Heading3"/>
       </w:pPr>
-      <w:bookmarkStart w:id="21" w:name="_Toc232428143"/>
-      <w:r>
-        <w:t>K</w:t>
-      </w:r>
-      <w:r>
-        <w:t>ompromis sa stupnjem djelovanja</w:t>
+      <w:bookmarkStart w:id="21" w:name="_Toc232881719"/>
+      <w:r>
+        <w:t>Kompenzacija harmonijskih izobličenja</w:t>
       </w:r>
       <w:bookmarkEnd w:id="21"/>
     </w:p>
@@ -11254,104 +10902,152 @@
         <w:ind w:firstLine="708"/>
       </w:pPr>
       <w:r>
-        <w:t xml:space="preserve">U pojačalima postoji kompromis između malog harmonijskog izobličenja i stupnja djelovanja. Pojačala s malim harmonijskim izobličenjem često imaju manji stupanj djelovanja </w:t>
-      </w:r>
-      <w:r>
-        <w:t>zbog potrošnje snage i bez korisnog izlaznog signala. Pojačala s većim stupnjem djelovanja su učinkovitiji, ali su osjetljiva na pojavu nelinearnih izobličenja.</w:t>
+        <w:t xml:space="preserve">Harmonijska izobličenja se mogu smanjiti pravilnim namještanjem statičke radne točke, primjenom negativne povratne veze i prikladnim </w:t>
+      </w:r>
+      <w:proofErr w:type="spellStart"/>
+      <w:r>
+        <w:t>prednaponom</w:t>
+      </w:r>
+      <w:proofErr w:type="spellEnd"/>
+      <w:r>
+        <w:t xml:space="preserve"> izlaznog stupnja. </w:t>
+      </w:r>
+      <w:proofErr w:type="spellStart"/>
+      <w:r>
+        <w:t>Preskočno</w:t>
+      </w:r>
+      <w:proofErr w:type="spellEnd"/>
+      <w:r>
+        <w:t xml:space="preserve"> izobličenje se korigira dovođenjem </w:t>
+      </w:r>
+      <w:proofErr w:type="spellStart"/>
+      <w:r>
+        <w:t>prednapona</w:t>
+      </w:r>
+      <w:proofErr w:type="spellEnd"/>
+      <w:r>
+        <w:t xml:space="preserve">. Rezanje izlaznog signala se smanjuje </w:t>
+      </w:r>
+      <w:r>
+        <w:t>pravilnim odabirom napona napajanja i ograničenjem amplitude ulaznog signala.</w:t>
       </w:r>
     </w:p>
     <w:p>
       <w:pPr>
-        <w:ind w:firstLine="708"/>
-      </w:pPr>
-    </w:p>
-    <w:p>
-      <w:pPr>
-        <w:pStyle w:val="Heading1"/>
-      </w:pPr>
-      <w:bookmarkStart w:id="22" w:name="_Toc232428144"/>
-      <w:r>
-        <w:t>Analiza pojačala</w:t>
+        <w:pStyle w:val="Heading3"/>
+      </w:pPr>
+      <w:bookmarkStart w:id="22" w:name="_Toc232881720"/>
+      <w:r>
+        <w:t>K</w:t>
+      </w:r>
+      <w:r>
+        <w:t>ompromis sa stupnjem djelovanja</w:t>
       </w:r>
       <w:bookmarkEnd w:id="22"/>
     </w:p>
     <w:p>
       <w:pPr>
-        <w:ind w:firstLine="432"/>
-      </w:pPr>
-      <w:r>
-        <w:t xml:space="preserve">U ovom </w:t>
-      </w:r>
-      <w:r>
-        <w:t>su poglavlju</w:t>
-      </w:r>
-      <w:r>
-        <w:t xml:space="preserve"> prikazani rezultati analitičkog proračuna </w:t>
-      </w:r>
-      <w:proofErr w:type="spellStart"/>
-      <w:r>
-        <w:t>jednostupanjskih</w:t>
-      </w:r>
-      <w:proofErr w:type="spellEnd"/>
-      <w:r>
-        <w:t xml:space="preserve"> pojačala klase A, klase B i klase AB. </w:t>
-      </w:r>
-      <w:r>
-        <w:t>Određeni su parametri sklopova, stupanj djelovanja, amplitude prvih osam harmonika i ukupno harmonijsko izobličenje.</w:t>
+        <w:ind w:firstLine="708"/>
+      </w:pPr>
+      <w:r>
+        <w:t xml:space="preserve">U pojačalima postoji kompromis između malog harmonijskog izobličenja i stupnja djelovanja. Pojačala s malim harmonijskim izobličenjem često imaju manji stupanj djelovanja </w:t>
+      </w:r>
+      <w:r>
+        <w:t>zbog potrošnje snage i bez korisnog izlaznog signala. Pojačala s većim stupnjem djelovanja su učinkovitiji, ali su osjetljiva na pojavu nelinearnih izobličenja.</w:t>
       </w:r>
     </w:p>
     <w:p>
       <w:pPr>
-        <w:ind w:firstLine="432"/>
+        <w:ind w:firstLine="708"/>
       </w:pPr>
     </w:p>
     <w:p>
       <w:pPr>
-        <w:pStyle w:val="Heading2"/>
-      </w:pPr>
-      <w:bookmarkStart w:id="23" w:name="_Toc232428145"/>
-      <w:r>
-        <w:lastRenderedPageBreak/>
-        <w:t>Pojačalo klase A</w:t>
+        <w:pStyle w:val="Heading1"/>
+      </w:pPr>
+      <w:bookmarkStart w:id="23" w:name="_Toc232881721"/>
+      <w:r>
+        <w:t>Analiza pojačala</w:t>
       </w:r>
       <w:bookmarkEnd w:id="23"/>
     </w:p>
     <w:p>
       <w:pPr>
-        <w:ind w:firstLine="576"/>
-      </w:pPr>
-      <w:r>
-        <w:t xml:space="preserve">Za analizu pojačala klase A, odabrana je topologija spoja zajedničkog kolektora (SZC). </w:t>
-      </w:r>
-      <w:r>
-        <w:t>U ovoj topologiji, tranzistor</w:t>
-      </w:r>
-      <w:r>
-        <w:t xml:space="preserve"> vodi tijekom cijele periode signala, zbog čega</w:t>
-      </w:r>
-      <w:r>
-        <w:t xml:space="preserve"> se u idealnim uvj</w:t>
-      </w:r>
-      <w:r>
-        <w:t xml:space="preserve">etima ne pojavljuje </w:t>
+        <w:ind w:firstLine="432"/>
+      </w:pPr>
+      <w:r>
+        <w:t xml:space="preserve">U ovom </w:t>
+      </w:r>
+      <w:r>
+        <w:t>su poglavlju</w:t>
+      </w:r>
+      <w:r>
+        <w:t xml:space="preserve"> prikazani rezultati analitičkog proračuna </w:t>
       </w:r>
       <w:proofErr w:type="spellStart"/>
       <w:r>
-        <w:t>preskočno</w:t>
+        <w:t>jednostupanjskih</w:t>
       </w:r>
       <w:proofErr w:type="spellEnd"/>
       <w:r>
-        <w:t xml:space="preserve"> izobličenje.</w:t>
-      </w:r>
-      <w:r>
-        <w:t xml:space="preserve"> </w:t>
+        <w:t xml:space="preserve"> pojačala klase A, klase B i klase AB. </w:t>
+      </w:r>
+      <w:r>
+        <w:t>Određeni su parametri sklopova, stupanj djelovanja, amplitude prvih osam harmonika i ukupno harmonijsko izobličenje.</w:t>
       </w:r>
     </w:p>
     <w:p>
       <w:pPr>
+        <w:ind w:firstLine="432"/>
+      </w:pPr>
+    </w:p>
+    <w:p>
+      <w:pPr>
+        <w:pStyle w:val="Heading2"/>
+      </w:pPr>
+      <w:bookmarkStart w:id="24" w:name="_Toc232881722"/>
+      <w:r>
+        <w:lastRenderedPageBreak/>
+        <w:t>Pojačalo klase A</w:t>
+      </w:r>
+      <w:bookmarkEnd w:id="24"/>
+    </w:p>
+    <w:p>
+      <w:pPr>
+        <w:ind w:firstLine="576"/>
+      </w:pPr>
+      <w:r>
+        <w:t xml:space="preserve">Za analizu pojačala klase A, odabrana je topologija spoja zajedničkog kolektora (SZC). </w:t>
+      </w:r>
+      <w:r>
+        <w:t>U ovoj topologiji, tranzistor</w:t>
+      </w:r>
+      <w:r>
+        <w:t xml:space="preserve"> vodi tijekom cijele periode signala, zbog čega</w:t>
+      </w:r>
+      <w:r>
+        <w:t xml:space="preserve"> se u idealnim uvj</w:t>
+      </w:r>
+      <w:r>
+        <w:t xml:space="preserve">etima ne pojavljuje </w:t>
+      </w:r>
+      <w:proofErr w:type="spellStart"/>
+      <w:r>
+        <w:t>preskočno</w:t>
+      </w:r>
+      <w:proofErr w:type="spellEnd"/>
+      <w:r>
+        <w:t xml:space="preserve"> izobličenje.</w:t>
+      </w:r>
+      <w:r>
+        <w:t xml:space="preserve"> </w:t>
+      </w:r>
+    </w:p>
+    <w:p>
+      <w:pPr>
         <w:pStyle w:val="Heading3"/>
       </w:pPr>
-      <w:bookmarkStart w:id="24" w:name="_Toc232428146"/>
+      <w:bookmarkStart w:id="25" w:name="_Toc232881723"/>
       <w:r>
         <w:t>Shema poj</w:t>
       </w:r>
@@ -11361,7 +11057,7 @@
       <w:r>
         <w:t>čala</w:t>
       </w:r>
-      <w:bookmarkEnd w:id="24"/>
+      <w:bookmarkEnd w:id="25"/>
       <w:r>
         <w:t xml:space="preserve"> </w:t>
       </w:r>
@@ -11473,12 +11169,12 @@
       <w:pPr>
         <w:pStyle w:val="Heading3"/>
       </w:pPr>
-      <w:bookmarkStart w:id="25" w:name="_Toc232428147"/>
+      <w:bookmarkStart w:id="26" w:name="_Toc232881724"/>
       <w:r>
         <w:lastRenderedPageBreak/>
         <w:t>Statička analiza sklopa</w:t>
       </w:r>
-      <w:bookmarkEnd w:id="25"/>
+      <w:bookmarkEnd w:id="26"/>
     </w:p>
     <w:p>
       <w:pPr>
@@ -13261,11 +12957,11 @@
       <w:pPr>
         <w:pStyle w:val="Heading3"/>
       </w:pPr>
-      <w:bookmarkStart w:id="26" w:name="_Toc232428148"/>
+      <w:bookmarkStart w:id="27" w:name="_Toc232881725"/>
       <w:r>
         <w:t>Dinamička analiza sklopa</w:t>
       </w:r>
-      <w:bookmarkEnd w:id="26"/>
+      <w:bookmarkEnd w:id="27"/>
     </w:p>
     <w:p>
       <w:pPr>
@@ -17566,11 +17262,11 @@
       <w:pPr>
         <w:pStyle w:val="Heading3"/>
       </w:pPr>
-      <w:bookmarkStart w:id="27" w:name="_Toc232428149"/>
+      <w:bookmarkStart w:id="28" w:name="_Toc232881726"/>
       <w:r>
         <w:t>Prikaz rezultata harmonijskog izobličenja dobivenih proračunom</w:t>
       </w:r>
-      <w:bookmarkEnd w:id="27"/>
+      <w:bookmarkEnd w:id="28"/>
     </w:p>
     <w:p>
       <w:pPr>
@@ -20862,11 +20558,11 @@
       <w:pPr>
         <w:pStyle w:val="Heading2"/>
       </w:pPr>
-      <w:bookmarkStart w:id="28" w:name="_Toc232428150"/>
+      <w:bookmarkStart w:id="29" w:name="_Toc232881727"/>
       <w:r>
         <w:t>Pojačalo klase B</w:t>
       </w:r>
-      <w:bookmarkEnd w:id="28"/>
+      <w:bookmarkEnd w:id="29"/>
     </w:p>
     <w:p>
       <w:pPr>
@@ -20916,11 +20612,11 @@
       <w:pPr>
         <w:pStyle w:val="Heading3"/>
       </w:pPr>
-      <w:bookmarkStart w:id="29" w:name="_Toc232428151"/>
+      <w:bookmarkStart w:id="30" w:name="_Toc232881728"/>
       <w:r>
         <w:t>Prikaz sheme klase B</w:t>
       </w:r>
-      <w:bookmarkEnd w:id="29"/>
+      <w:bookmarkEnd w:id="30"/>
     </w:p>
     <w:p>
       <w:pPr>
@@ -21011,12 +20707,12 @@
       <w:pPr>
         <w:pStyle w:val="Heading3"/>
       </w:pPr>
-      <w:bookmarkStart w:id="30" w:name="_Toc232428152"/>
+      <w:bookmarkStart w:id="31" w:name="_Toc232881729"/>
       <w:r>
         <w:lastRenderedPageBreak/>
         <w:t>Proračun stupnja djelovanja</w:t>
       </w:r>
-      <w:bookmarkEnd w:id="30"/>
+      <w:bookmarkEnd w:id="31"/>
     </w:p>
     <w:p>
       <w:pPr>
@@ -22578,12 +22274,12 @@
       <w:pPr>
         <w:pStyle w:val="Heading3"/>
       </w:pPr>
-      <w:bookmarkStart w:id="31" w:name="_Toc232428153"/>
+      <w:bookmarkStart w:id="32" w:name="_Toc232881730"/>
       <w:r>
         <w:lastRenderedPageBreak/>
         <w:t>Prikaz rezultata proračuna THD</w:t>
       </w:r>
-      <w:bookmarkEnd w:id="31"/>
+      <w:bookmarkEnd w:id="32"/>
     </w:p>
     <w:p>
       <w:pPr>
@@ -24808,12 +24504,12 @@
       <w:pPr>
         <w:pStyle w:val="Heading2"/>
       </w:pPr>
-      <w:bookmarkStart w:id="32" w:name="_Toc232428154"/>
+      <w:bookmarkStart w:id="33" w:name="_Toc232881731"/>
       <w:r>
         <w:lastRenderedPageBreak/>
         <w:t>Pojačalo klase AB</w:t>
       </w:r>
-      <w:bookmarkEnd w:id="32"/>
+      <w:bookmarkEnd w:id="33"/>
     </w:p>
     <w:p>
       <w:pPr>
@@ -24874,11 +24570,11 @@
       <w:pPr>
         <w:pStyle w:val="Heading3"/>
       </w:pPr>
-      <w:bookmarkStart w:id="33" w:name="_Toc232428155"/>
+      <w:bookmarkStart w:id="34" w:name="_Toc232881732"/>
       <w:r>
         <w:t>Prikaz sheme klase AB</w:t>
       </w:r>
-      <w:bookmarkEnd w:id="33"/>
+      <w:bookmarkEnd w:id="34"/>
     </w:p>
     <w:p>
       <w:pPr>
@@ -25001,12 +24697,12 @@
       <w:pPr>
         <w:pStyle w:val="Heading3"/>
       </w:pPr>
-      <w:bookmarkStart w:id="34" w:name="_Toc232428156"/>
+      <w:bookmarkStart w:id="35" w:name="_Toc232881733"/>
       <w:r>
         <w:lastRenderedPageBreak/>
         <w:t>Proračun stupnja djelovanja</w:t>
       </w:r>
-      <w:bookmarkEnd w:id="34"/>
+      <w:bookmarkEnd w:id="35"/>
     </w:p>
     <w:p>
       <w:pPr>
@@ -26466,12 +26162,12 @@
       <w:pPr>
         <w:pStyle w:val="Heading3"/>
       </w:pPr>
-      <w:bookmarkStart w:id="35" w:name="_Toc232428157"/>
+      <w:bookmarkStart w:id="36" w:name="_Toc232881734"/>
       <w:r>
         <w:lastRenderedPageBreak/>
         <w:t>Prikaz rezultata proračuna THD</w:t>
       </w:r>
-      <w:bookmarkEnd w:id="35"/>
+      <w:bookmarkEnd w:id="36"/>
     </w:p>
     <w:p>
       <w:pPr>
@@ -28694,18 +28390,22 @@
       <w:pPr>
         <w:pStyle w:val="Heading1"/>
       </w:pPr>
+      <w:bookmarkStart w:id="37" w:name="_Toc232881735"/>
       <w:r>
         <w:lastRenderedPageBreak/>
         <w:t>Rezultati simulacija</w:t>
       </w:r>
+      <w:bookmarkEnd w:id="37"/>
     </w:p>
     <w:p>
       <w:pPr>
         <w:pStyle w:val="Heading2"/>
       </w:pPr>
+      <w:bookmarkStart w:id="38" w:name="_Toc232881736"/>
       <w:r>
         <w:t>Pojačalo klase A (SZC)</w:t>
       </w:r>
+      <w:bookmarkEnd w:id="38"/>
     </w:p>
     <w:tbl>
       <w:tblPr>
@@ -29315,9 +29015,9 @@
         <w:tblLook w:val="04A0" w:firstRow="1" w:lastRow="0" w:firstColumn="1" w:lastColumn="0" w:noHBand="0" w:noVBand="1"/>
       </w:tblPr>
       <w:tblGrid>
-        <w:gridCol w:w="2944"/>
-        <w:gridCol w:w="2798"/>
-        <w:gridCol w:w="2751"/>
+        <w:gridCol w:w="2914"/>
+        <w:gridCol w:w="2855"/>
+        <w:gridCol w:w="2724"/>
       </w:tblGrid>
       <w:tr>
         <w:trPr>
@@ -29384,15 +29084,11 @@
               <w:jc w:val="center"/>
             </w:pPr>
             <w:r>
-              <w:rPr>
-                <w:noProof/>
-                <w:lang w:eastAsia="hr-HR"/>
-              </w:rPr>
               <w:drawing>
-                <wp:inline distT="0" distB="0" distL="0" distR="0" wp14:anchorId="7EB2256D" wp14:editId="29562E6F">
-                  <wp:extent cx="1647810" cy="1526650"/>
-                  <wp:effectExtent l="0" t="0" r="0" b="0"/>
-                  <wp:docPr id="14" name="Picture 14"/>
+                <wp:inline distT="0" distB="0" distL="0" distR="0" wp14:anchorId="716FB351" wp14:editId="3D38DD9D">
+                  <wp:extent cx="1724935" cy="1549021"/>
+                  <wp:effectExtent l="0" t="0" r="8890" b="0"/>
+                  <wp:docPr id="1735447080" name="Picture 1"/>
                   <wp:cNvGraphicFramePr>
                     <a:graphicFrameLocks xmlns:a="http://schemas.openxmlformats.org/drawingml/2006/main" noChangeAspect="1"/>
                   </wp:cNvGraphicFramePr>
@@ -29400,17 +29096,11 @@
                     <a:graphicData uri="http://schemas.openxmlformats.org/drawingml/2006/picture">
                       <pic:pic xmlns:pic="http://schemas.openxmlformats.org/drawingml/2006/picture">
                         <pic:nvPicPr>
-                          <pic:cNvPr id="3" name="MOJA SLIKA.jpg"/>
+                          <pic:cNvPr id="1735447080" name=""/>
                           <pic:cNvPicPr/>
                         </pic:nvPicPr>
                         <pic:blipFill>
-                          <a:blip r:embed="rId13">
-                            <a:extLst>
-                              <a:ext uri="{28A0092B-C50C-407E-A947-70E740481C1C}">
-                                <a14:useLocalDpi xmlns:a14="http://schemas.microsoft.com/office/drawing/2010/main" val="0"/>
-                              </a:ext>
-                            </a:extLst>
-                          </a:blip>
+                          <a:blip r:embed="rId14"/>
                           <a:stretch>
                             <a:fillRect/>
                           </a:stretch>
@@ -29418,7 +29108,7 @@
                         <pic:spPr>
                           <a:xfrm>
                             <a:off x="0" y="0"/>
-                            <a:ext cx="1748660" cy="1620085"/>
+                            <a:ext cx="1735484" cy="1558495"/>
                           </a:xfrm>
                           <a:prstGeom prst="rect">
                             <a:avLst/>
@@ -29681,66 +29371,82 @@
       <w:pPr>
         <w:pStyle w:val="Heading2"/>
       </w:pPr>
+      <w:bookmarkStart w:id="39" w:name="_Toc232881737"/>
       <w:r>
         <w:lastRenderedPageBreak/>
         <w:t>Pojačalo klase B</w:t>
       </w:r>
+      <w:bookmarkEnd w:id="39"/>
     </w:p>
     <w:p>
       <w:pPr>
         <w:pStyle w:val="Heading2"/>
       </w:pPr>
+      <w:bookmarkStart w:id="40" w:name="_Toc232881738"/>
       <w:r>
         <w:t>Pojačalo klase AB</w:t>
       </w:r>
+      <w:bookmarkEnd w:id="40"/>
     </w:p>
     <w:p>
       <w:pPr>
         <w:pStyle w:val="Heading2"/>
       </w:pPr>
+      <w:bookmarkStart w:id="41" w:name="_Toc232881739"/>
       <w:r>
         <w:t>Usporedba rezultata proračuna i simulacije</w:t>
       </w:r>
+      <w:bookmarkEnd w:id="41"/>
     </w:p>
     <w:p>
       <w:pPr>
         <w:pStyle w:val="Heading1"/>
       </w:pPr>
+      <w:bookmarkStart w:id="42" w:name="_Toc232881740"/>
       <w:r>
         <w:t>Rezultati mjerenja</w:t>
       </w:r>
+      <w:bookmarkEnd w:id="42"/>
     </w:p>
     <w:p>
       <w:pPr>
         <w:pStyle w:val="Heading2"/>
       </w:pPr>
+      <w:bookmarkStart w:id="43" w:name="_Toc232881741"/>
       <w:r>
         <w:t>Pojačalo klase A (SZC)</w:t>
       </w:r>
+      <w:bookmarkEnd w:id="43"/>
     </w:p>
     <w:p>
       <w:pPr>
         <w:pStyle w:val="Heading2"/>
       </w:pPr>
+      <w:bookmarkStart w:id="44" w:name="_Toc232881742"/>
       <w:r>
         <w:t>Pojačalo klase B</w:t>
       </w:r>
+      <w:bookmarkEnd w:id="44"/>
     </w:p>
     <w:p>
       <w:pPr>
         <w:pStyle w:val="Heading2"/>
       </w:pPr>
+      <w:bookmarkStart w:id="45" w:name="_Toc232881743"/>
       <w:r>
         <w:t>Pojačalo klase AB</w:t>
       </w:r>
+      <w:bookmarkEnd w:id="45"/>
     </w:p>
     <w:p>
       <w:pPr>
         <w:pStyle w:val="Heading1"/>
       </w:pPr>
+      <w:bookmarkStart w:id="46" w:name="_Toc232881744"/>
       <w:r>
         <w:t>Usporedba rezultata analize, simulacija i mjerenja</w:t>
       </w:r>
+      <w:bookmarkEnd w:id="46"/>
     </w:p>
     <w:p/>
     <w:p/>
@@ -29749,21 +29455,21 @@
       <w:pPr>
         <w:pStyle w:val="Heading1"/>
       </w:pPr>
-      <w:bookmarkStart w:id="36" w:name="_Toc232428170"/>
+      <w:bookmarkStart w:id="47" w:name="_Toc232881745"/>
       <w:r>
         <w:t>Zaključak</w:t>
       </w:r>
-      <w:bookmarkEnd w:id="36"/>
+      <w:bookmarkEnd w:id="47"/>
     </w:p>
     <w:p>
       <w:pPr>
         <w:pStyle w:val="Heading1"/>
       </w:pPr>
-      <w:bookmarkStart w:id="37" w:name="_Toc232428171"/>
+      <w:bookmarkStart w:id="48" w:name="_Toc232881746"/>
       <w:r>
         <w:t>Literatura</w:t>
       </w:r>
-      <w:bookmarkEnd w:id="37"/>
+      <w:bookmarkEnd w:id="48"/>
     </w:p>
     <w:p>
       <w:r>
@@ -29787,14 +29493,14 @@
         </w:rPr>
         <w:t xml:space="preserve"> i udžbenike </w:t>
       </w:r>
-      <w:bookmarkStart w:id="38" w:name="_Hlk182807103"/>
+      <w:bookmarkStart w:id="49" w:name="_Hlk182807103"/>
       <w:r>
         <w:rPr>
           <w:szCs w:val="24"/>
         </w:rPr>
         <w:t xml:space="preserve">visokoškolske </w:t>
       </w:r>
-      <w:bookmarkEnd w:id="38"/>
+      <w:bookmarkEnd w:id="49"/>
       <w:r>
         <w:rPr>
           <w:szCs w:val="24"/>
@@ -30209,12 +29915,12 @@
       <w:pPr>
         <w:pStyle w:val="Heading1"/>
       </w:pPr>
-      <w:bookmarkStart w:id="39" w:name="_Toc232428172"/>
+      <w:bookmarkStart w:id="50" w:name="_Toc232881747"/>
       <w:r>
         <w:lastRenderedPageBreak/>
         <w:t>Životopis</w:t>
       </w:r>
-      <w:bookmarkEnd w:id="39"/>
+      <w:bookmarkEnd w:id="50"/>
     </w:p>
     <w:p>
       <w:r>
@@ -30240,7 +29946,7 @@
       <w:pPr>
         <w:pStyle w:val="Heading1"/>
       </w:pPr>
-      <w:bookmarkStart w:id="40" w:name="_Toc232428173"/>
+      <w:bookmarkStart w:id="51" w:name="_Toc232881748"/>
       <w:r>
         <w:lastRenderedPageBreak/>
         <w:t>PRILOG</w:t>
@@ -30248,7 +29954,7 @@
       <w:r>
         <w:t xml:space="preserve"> I – Naslov priloga</w:t>
       </w:r>
-      <w:bookmarkEnd w:id="40"/>
+      <w:bookmarkEnd w:id="51"/>
     </w:p>
     <w:p>
       <w:pPr>
@@ -30321,7 +30027,7 @@
       <w:pPr>
         <w:spacing w:before="0" w:after="0" w:line="240" w:lineRule="auto"/>
       </w:pPr>
-      <w:hyperlink r:id="rId14" w:history="1">
+      <w:hyperlink r:id="rId15" w:history="1">
         <w:r>
           <w:rPr>
             <w:rStyle w:val="Hyperlink"/>
@@ -30354,8 +30060,8 @@
           <w:szCs w:val="22"/>
         </w:rPr>
         <w:sectPr>
-          <w:headerReference w:type="default" r:id="rId15"/>
-          <w:footerReference w:type="default" r:id="rId16"/>
+          <w:headerReference w:type="default" r:id="rId16"/>
+          <w:footerReference w:type="default" r:id="rId17"/>
           <w:pgSz w:w="11906" w:h="16838"/>
           <w:pgMar w:top="1418" w:right="1418" w:bottom="1418" w:left="1985" w:header="709" w:footer="709" w:gutter="0"/>
           <w:pgNumType w:start="1"/>
@@ -30363,9 +30069,9 @@
           <w:docGrid w:linePitch="360"/>
         </w:sectPr>
       </w:pPr>
-      <w:bookmarkStart w:id="41" w:name="_Toc347742350"/>
+      <w:bookmarkStart w:id="52" w:name="_Toc347742350"/>
     </w:p>
-    <w:bookmarkEnd w:id="41"/>
+    <w:bookmarkEnd w:id="52"/>
     <w:p>
       <w:pPr>
         <w:spacing w:before="0" w:after="0" w:line="240" w:lineRule="auto"/>
@@ -30377,7 +30083,7 @@
       </w:pPr>
     </w:p>
     <w:sectPr>
-      <w:footerReference w:type="default" r:id="rId17"/>
+      <w:footerReference w:type="default" r:id="rId18"/>
       <w:type w:val="continuous"/>
       <w:pgSz w:w="11906" w:h="16838"/>
       <w:pgMar w:top="1418" w:right="1418" w:bottom="1418" w:left="1985" w:header="709" w:footer="709" w:gutter="0"/>

</xml_diff>